<commit_message>
fix: review AA — ảnh theo khổ màn không tải ảnh thừa, giữ lựa chọn khi xoay, phóng to không cuộn ngang, dọn dữ liệu mẫu đúng phạm vi, chữ hướng dẫn khớp nút thật
Co-Authored-By: Claude Opus 5.5 <noreply@anthropic.com>
Claude-Session: https://claude.ai/code/session_0128L55kVDRGjUqDDqt8RXmg
</commit_message>
<xml_diff>
--- a/public/guide/huong-dan-su-dung.docx
+++ b/public/guide/huong-dan-su-dung.docx
@@ -1677,7 +1677,7 @@
           <w:bCs/>
           <w:color w:val="0F172A"/>
         </w:rPr>
-        <w:t xml:space="preserve">+ Thêm ca dạy mới</w:t>
+        <w:t xml:space="preserve">+ Tạo ca dạy</w:t>
       </w:r>
       <w:r>
         <w:rPr>
@@ -2282,7 +2282,22 @@
           <w:b w:val="false"/>
           <w:bCs w:val="false"/>
         </w:rPr>
-        <w:t xml:space="preserve">Chọn trạng thái cho từng học sinh: có mặt, vắng có phép hoặc vắng không phép.</w:t>
+        <w:t xml:space="preserve">Bấm dấu tích (có mặt) hoặc dấu X (vắng) cho từng học sinh. Bấm </w:t>
+      </w:r>
+      <w:r>
+        <w:rPr>
+          <w:b/>
+          <w:bCs/>
+          <w:color w:val="0F172A"/>
+        </w:rPr>
+        <w:t xml:space="preserve">Tất cả có mặt</w:t>
+      </w:r>
+      <w:r>
+        <w:rPr>
+          <w:b w:val="false"/>
+          <w:bCs w:val="false"/>
+        </w:rPr>
+        <w:t xml:space="preserve"> để đánh dấu nhanh cả ca.</w:t>
       </w:r>
     </w:p>
     <w:p>
@@ -2403,7 +2418,7 @@
           <w:bCs/>
           <w:color w:val="0F172A"/>
         </w:rPr>
-        <w:t xml:space="preserve">Lưu</w:t>
+        <w:t xml:space="preserve">Lưu điểm danh</w:t>
       </w:r>
       <w:r>
         <w:rPr>

</xml_diff>

<commit_message>
feat: hop nhap Excel huong dan tu tao Google Form cho phu huynh
</commit_message>
<xml_diff>
--- a/public/guide/huong-dan-su-dung.docx
+++ b/public/guide/huong-dan-su-dung.docx
@@ -1614,6 +1614,315 @@
           <w:bCs w:val="false"/>
         </w:rPr>
         <w:t xml:space="preserve">Sửa dòng lỗi trong file rồi chọn lại, hoặc bỏ qua dòng lỗi. Tick ô đồng ý và bấm nhập.</w:t>
+      </w:r>
+    </w:p>
+    <w:p>
+      <w:pPr>
+        <w:spacing w:after="100"/>
+        <w:ind w:left="360"/>
+      </w:pPr>
+      <w:r>
+        <w:rPr>
+          <w:b/>
+          <w:bCs/>
+          <w:color w:val="0F766E"/>
+        </w:rPr>
+        <w:t xml:space="preserve">Bước 5. </w:t>
+      </w:r>
+      <w:r>
+        <w:rPr>
+          <w:b w:val="false"/>
+          <w:bCs w:val="false"/>
+        </w:rPr>
+        <w:t xml:space="preserve">Chưa có danh sách: trong hộp </w:t>
+      </w:r>
+      <w:r>
+        <w:rPr>
+          <w:b/>
+          <w:bCs/>
+          <w:color w:val="0F172A"/>
+        </w:rPr>
+        <w:t xml:space="preserve">Nhập Excel</w:t>
+      </w:r>
+      <w:r>
+        <w:rPr>
+          <w:b w:val="false"/>
+          <w:bCs w:val="false"/>
+        </w:rPr>
+        <w:t xml:space="preserve"> mở </w:t>
+      </w:r>
+      <w:r>
+        <w:rPr>
+          <w:b/>
+          <w:bCs/>
+          <w:color w:val="0F172A"/>
+        </w:rPr>
+        <w:t xml:space="preserve">Chưa có danh sách? Nhờ phụ huynh điền qua Google Form</w:t>
+      </w:r>
+      <w:r>
+        <w:rPr>
+          <w:b w:val="false"/>
+          <w:bCs w:val="false"/>
+        </w:rPr>
+        <w:t xml:space="preserve">, bấm </w:t>
+      </w:r>
+      <w:r>
+        <w:rPr>
+          <w:b/>
+          <w:bCs/>
+          <w:color w:val="0F172A"/>
+        </w:rPr>
+        <w:t xml:space="preserve">Tạo Google Form</w:t>
+      </w:r>
+      <w:r>
+        <w:rPr>
+          <w:b w:val="false"/>
+          <w:bCs w:val="false"/>
+        </w:rPr>
+        <w:t xml:space="preserve"> (cần tài khoản Google).</w:t>
+      </w:r>
+    </w:p>
+    <w:p>
+      <w:pPr>
+        <w:spacing w:after="100"/>
+        <w:ind w:left="360"/>
+      </w:pPr>
+      <w:r>
+        <w:rPr>
+          <w:b/>
+          <w:bCs/>
+          <w:color w:val="0F766E"/>
+        </w:rPr>
+        <w:t xml:space="preserve">Bước 6. </w:t>
+      </w:r>
+      <w:r>
+        <w:rPr>
+          <w:b w:val="false"/>
+          <w:bCs w:val="false"/>
+        </w:rPr>
+        <w:t xml:space="preserve">Tạo 5 câu hỏi đúng tên: </w:t>
+      </w:r>
+      <w:r>
+        <w:rPr>
+          <w:b/>
+          <w:bCs/>
+          <w:color w:val="0F172A"/>
+        </w:rPr>
+        <w:t xml:space="preserve">Họ tên</w:t>
+      </w:r>
+      <w:r>
+        <w:rPr>
+          <w:b w:val="false"/>
+          <w:bCs w:val="false"/>
+        </w:rPr>
+        <w:t xml:space="preserve">, </w:t>
+      </w:r>
+      <w:r>
+        <w:rPr>
+          <w:b/>
+          <w:bCs/>
+          <w:color w:val="0F172A"/>
+        </w:rPr>
+        <w:t xml:space="preserve">Lớp</w:t>
+      </w:r>
+      <w:r>
+        <w:rPr>
+          <w:b w:val="false"/>
+          <w:bCs w:val="false"/>
+        </w:rPr>
+        <w:t xml:space="preserve">, </w:t>
+      </w:r>
+      <w:r>
+        <w:rPr>
+          <w:b/>
+          <w:bCs/>
+          <w:color w:val="0F172A"/>
+        </w:rPr>
+        <w:t xml:space="preserve">Tên phụ huynh</w:t>
+      </w:r>
+      <w:r>
+        <w:rPr>
+          <w:b w:val="false"/>
+          <w:bCs w:val="false"/>
+        </w:rPr>
+        <w:t xml:space="preserve">, </w:t>
+      </w:r>
+      <w:r>
+        <w:rPr>
+          <w:b/>
+          <w:bCs/>
+          <w:color w:val="0F172A"/>
+        </w:rPr>
+        <w:t xml:space="preserve">SĐT phụ huynh</w:t>
+      </w:r>
+      <w:r>
+        <w:rPr>
+          <w:b w:val="false"/>
+          <w:bCs w:val="false"/>
+        </w:rPr>
+        <w:t xml:space="preserve">, </w:t>
+      </w:r>
+      <w:r>
+        <w:rPr>
+          <w:b/>
+          <w:bCs/>
+          <w:color w:val="0F172A"/>
+        </w:rPr>
+        <w:t xml:space="preserve">Ghi chú</w:t>
+      </w:r>
+      <w:r>
+        <w:rPr>
+          <w:b w:val="false"/>
+          <w:bCs w:val="false"/>
+        </w:rPr>
+        <w:t xml:space="preserve"> (bấm nút sao chép cạnh từng tên rồi dán). Họ tên và Lớp bật </w:t>
+      </w:r>
+      <w:r>
+        <w:rPr>
+          <w:b/>
+          <w:bCs/>
+          <w:color w:val="0F172A"/>
+        </w:rPr>
+        <w:t xml:space="preserve">Bắt buộc</w:t>
+      </w:r>
+      <w:r>
+        <w:rPr>
+          <w:b w:val="false"/>
+          <w:bCs w:val="false"/>
+        </w:rPr>
+        <w:t xml:space="preserve">; Lớp nên dùng </w:t>
+      </w:r>
+      <w:r>
+        <w:rPr>
+          <w:b/>
+          <w:bCs/>
+          <w:color w:val="0F172A"/>
+        </w:rPr>
+        <w:t xml:space="preserve">Menu thả xuống</w:t>
+      </w:r>
+      <w:r>
+        <w:rPr>
+          <w:b w:val="false"/>
+          <w:bCs w:val="false"/>
+        </w:rPr>
+        <w:t xml:space="preserve"> 1 đến 12.</w:t>
+      </w:r>
+    </w:p>
+    <w:p>
+      <w:pPr>
+        <w:spacing w:after="100"/>
+        <w:ind w:left="360"/>
+      </w:pPr>
+      <w:r>
+        <w:rPr>
+          <w:b/>
+          <w:bCs/>
+          <w:color w:val="0F766E"/>
+        </w:rPr>
+        <w:t xml:space="preserve">Bước 7. </w:t>
+      </w:r>
+      <w:r>
+        <w:rPr>
+          <w:b w:val="false"/>
+          <w:bCs w:val="false"/>
+        </w:rPr>
+        <w:t xml:space="preserve">Bấm </w:t>
+      </w:r>
+      <w:r>
+        <w:rPr>
+          <w:b/>
+          <w:bCs/>
+          <w:color w:val="0F172A"/>
+        </w:rPr>
+        <w:t xml:space="preserve">Xuất bản</w:t>
+      </w:r>
+      <w:r>
+        <w:rPr>
+          <w:b w:val="false"/>
+          <w:bCs w:val="false"/>
+        </w:rPr>
+        <w:t xml:space="preserve">, gửi link cho phụ huynh. Đủ câu trả lời: tab </w:t>
+      </w:r>
+      <w:r>
+        <w:rPr>
+          <w:b/>
+          <w:bCs/>
+          <w:color w:val="0F172A"/>
+        </w:rPr>
+        <w:t xml:space="preserve">Câu trả lời</w:t>
+      </w:r>
+      <w:r>
+        <w:rPr>
+          <w:b w:val="false"/>
+          <w:bCs w:val="false"/>
+        </w:rPr>
+        <w:t xml:space="preserve"> → </w:t>
+      </w:r>
+      <w:r>
+        <w:rPr>
+          <w:b/>
+          <w:bCs/>
+          <w:color w:val="0F172A"/>
+        </w:rPr>
+        <w:t xml:space="preserve">Liên kết với Trang tính</w:t>
+      </w:r>
+      <w:r>
+        <w:rPr>
+          <w:b w:val="false"/>
+          <w:bCs w:val="false"/>
+        </w:rPr>
+        <w:t xml:space="preserve"> → </w:t>
+      </w:r>
+      <w:r>
+        <w:rPr>
+          <w:b/>
+          <w:bCs/>
+          <w:color w:val="0F172A"/>
+        </w:rPr>
+        <w:t xml:space="preserve">Tệp → Tải xuống → Microsoft Excel (.xlsx)</w:t>
+      </w:r>
+      <w:r>
+        <w:rPr>
+          <w:b w:val="false"/>
+          <w:bCs w:val="false"/>
+        </w:rPr>
+        <w:t xml:space="preserve">.</w:t>
+      </w:r>
+    </w:p>
+    <w:p>
+      <w:pPr>
+        <w:spacing w:after="100"/>
+        <w:ind w:left="360"/>
+      </w:pPr>
+      <w:r>
+        <w:rPr>
+          <w:b/>
+          <w:bCs/>
+          <w:color w:val="0F766E"/>
+        </w:rPr>
+        <w:t xml:space="preserve">Bước 8. </w:t>
+      </w:r>
+      <w:r>
+        <w:rPr>
+          <w:b w:val="false"/>
+          <w:bCs w:val="false"/>
+        </w:rPr>
+        <w:t xml:space="preserve">Chọn file vừa tải ở hộp </w:t>
+      </w:r>
+      <w:r>
+        <w:rPr>
+          <w:b/>
+          <w:bCs/>
+          <w:color w:val="0F172A"/>
+        </w:rPr>
+        <w:t xml:space="preserve">Nhập Excel</w:t>
+      </w:r>
+      <w:r>
+        <w:rPr>
+          <w:b w:val="false"/>
+          <w:bCs w:val="false"/>
+        </w:rPr>
+        <w:t xml:space="preserve"> như file mẫu. File từ form không có học phí: học sinh có học phí 0đ, sửa trong hồ sơ học sinh.</w:t>
       </w:r>
     </w:p>
     <w:p>

</xml_diff>

<commit_message>
chore: phat hanh 0.16.0
</commit_message>
<xml_diff>
--- a/public/guide/huong-dan-su-dung.docx
+++ b/public/guide/huong-dan-su-dung.docx
@@ -4348,7 +4348,22 @@
           <w:b w:val="false"/>
           <w:bCs w:val="false"/>
         </w:rPr>
-        <w:t xml:space="preserve">Bấm mua hoặc gia hạn, chọn thời hạn. App hiện mã đơn và số tiền cần chuyển khoản.</w:t>
+        <w:t xml:space="preserve">Bấm mua hoặc gia hạn, chọn thời hạn và cách thanh toán rồi bấm </w:t>
+      </w:r>
+      <w:r>
+        <w:rPr>
+          <w:b/>
+          <w:bCs/>
+          <w:color w:val="0F172A"/>
+        </w:rPr>
+        <w:t xml:space="preserve">Tạo đơn</w:t>
+      </w:r>
+      <w:r>
+        <w:rPr>
+          <w:b w:val="false"/>
+          <w:bCs w:val="false"/>
+        </w:rPr>
+        <w:t xml:space="preserve">. App hiện mã QR, mã đơn và số tiền.</w:t>
       </w:r>
     </w:p>
     <w:p>
@@ -4369,7 +4384,58 @@
           <w:b w:val="false"/>
           <w:bCs w:val="false"/>
         </w:rPr>
-        <w:t xml:space="preserve">Chuyển khoản đúng nội dung mã đơn. Gói được kích hoạt sau khi quản trị viên xác nhận.</w:t>
+        <w:t xml:space="preserve">Chọn </w:t>
+      </w:r>
+      <w:r>
+        <w:rPr>
+          <w:b/>
+          <w:bCs/>
+          <w:color w:val="0F172A"/>
+        </w:rPr>
+        <w:t xml:space="preserve">Kích hoạt ngay sau khi chuyển khoản</w:t>
+      </w:r>
+      <w:r>
+        <w:rPr>
+          <w:b w:val="false"/>
+          <w:bCs w:val="false"/>
+        </w:rPr>
+        <w:t xml:space="preserve">: quét QR payOS, gói bật trong vài giây khi tiền vào, không phải chờ duyệt.</w:t>
+      </w:r>
+    </w:p>
+    <w:p>
+      <w:pPr>
+        <w:spacing w:after="100"/>
+        <w:ind w:left="360"/>
+      </w:pPr>
+      <w:r>
+        <w:rPr>
+          <w:b/>
+          <w:bCs/>
+          <w:color w:val="0F766E"/>
+        </w:rPr>
+        <w:t xml:space="preserve">Bước 4. </w:t>
+      </w:r>
+      <w:r>
+        <w:rPr>
+          <w:b w:val="false"/>
+          <w:bCs w:val="false"/>
+        </w:rPr>
+        <w:t xml:space="preserve">Chọn </w:t>
+      </w:r>
+      <w:r>
+        <w:rPr>
+          <w:b/>
+          <w:bCs/>
+          <w:color w:val="0F172A"/>
+        </w:rPr>
+        <w:t xml:space="preserve">Chuyển khoản, chờ admin duyệt</w:t>
+      </w:r>
+      <w:r>
+        <w:rPr>
+          <w:b w:val="false"/>
+          <w:bCs w:val="false"/>
+        </w:rPr>
+        <w:t xml:space="preserve">: chuyển khoản đúng nội dung mã đơn, rồi báo chủ app (Gọi, Zalo, Facebook ngay trên thẻ đơn). Gói được kích hoạt sau khi quản trị viên xác nhận.</w:t>
       </w:r>
     </w:p>
     <w:p>

</xml_diff>

<commit_message>
docs(ag): ảnh hướng dẫn mới chọn cách thanh toán khi mua gói, chụp lại toàn bộ ảnh + file Word
Co-Authored-By: Claude Opus 5.5 (1M context) <noreply@anthropic.com>
Claude-Session: https://claude.ai/code/session_0128L55kVDRGjUqDDqt8RXmg
</commit_message>
<xml_diff>
--- a/public/guide/huong-dan-su-dung.docx
+++ b/public/guide/huong-dan-su-dung.docx
@@ -4404,173 +4404,6 @@
     </w:p>
     <w:p>
       <w:pPr>
-        <w:spacing w:after="100"/>
-        <w:ind w:left="360"/>
-      </w:pPr>
-      <w:r>
-        <w:rPr>
-          <w:b/>
-          <w:bCs/>
-          <w:color w:val="0F766E"/>
-        </w:rPr>
-        <w:t xml:space="preserve">Bước 4. </w:t>
-      </w:r>
-      <w:r>
-        <w:rPr>
-          <w:b w:val="false"/>
-          <w:bCs w:val="false"/>
-        </w:rPr>
-        <w:t xml:space="preserve">Chọn </w:t>
-      </w:r>
-      <w:r>
-        <w:rPr>
-          <w:b/>
-          <w:bCs/>
-          <w:color w:val="0F172A"/>
-        </w:rPr>
-        <w:t xml:space="preserve">Chuyển khoản, chờ admin duyệt</w:t>
-      </w:r>
-      <w:r>
-        <w:rPr>
-          <w:b w:val="false"/>
-          <w:bCs w:val="false"/>
-        </w:rPr>
-        <w:t xml:space="preserve">: chuyển khoản đúng nội dung mã đơn, rồi báo chủ app (Gọi, Zalo, Facebook ngay trên thẻ đơn). Gói được kích hoạt sau khi quản trị viên xác nhận.</w:t>
-      </w:r>
-    </w:p>
-    <w:p>
-      <w:pPr>
-        <w:pBdr>
-          <w:left w:val="single" w:color="D97706" w:sz="18" w:space="6"/>
-        </w:pBdr>
-        <w:shd w:fill="FEF3C7" w:color="auto" w:val="clear"/>
-        <w:spacing w:after="60" w:before="60"/>
-        <w:ind w:left="360"/>
-      </w:pPr>
-      <w:r>
-        <w:rPr>
-          <w:b/>
-          <w:bCs/>
-        </w:rPr>
-        <w:t xml:space="preserve">Mẹo: </w:t>
-      </w:r>
-      <w:r>
-        <w:rPr>
-          <w:b w:val="false"/>
-          <w:bCs w:val="false"/>
-        </w:rPr>
-        <w:t xml:space="preserve">Gia hạn sớm trước khi hết hạn được tặng thêm tháng.</w:t>
-      </w:r>
-    </w:p>
-    <w:p>
-      <w:pPr>
-        <w:pStyle w:val="Heading1"/>
-        <w:pBdr>
-          <w:bottom w:val="single" w:color="0F766E" w:sz="12" w:space="4"/>
-        </w:pBdr>
-        <w:shd w:fill="E6F4F1" w:color="auto" w:val="clear"/>
-        <w:spacing w:after="160" w:before="360"/>
-      </w:pPr>
-      <w:r>
-        <w:rPr>
-          <w:b/>
-          <w:bCs/>
-          <w:color w:val="0F766E"/>
-          <w:sz w:val="32"/>
-          <w:szCs w:val="32"/>
-        </w:rPr>
-        <w:t xml:space="preserve">11. Thùng rác</w:t>
-      </w:r>
-    </w:p>
-    <w:p>
-      <w:pPr>
-        <w:spacing w:after="100"/>
-        <w:ind w:left="360"/>
-      </w:pPr>
-      <w:r>
-        <w:rPr>
-          <w:b/>
-          <w:bCs/>
-          <w:color w:val="0F766E"/>
-        </w:rPr>
-        <w:t xml:space="preserve">Bước 1. </w:t>
-      </w:r>
-      <w:r>
-        <w:rPr>
-          <w:b w:val="false"/>
-          <w:bCs w:val="false"/>
-        </w:rPr>
-        <w:t xml:space="preserve">Học sinh, môn, ca dạy, lần thu đã xoá đều vào </w:t>
-      </w:r>
-      <w:r>
-        <w:rPr>
-          <w:b/>
-          <w:bCs/>
-          <w:color w:val="0F172A"/>
-        </w:rPr>
-        <w:t xml:space="preserve">Thùng rác</w:t>
-      </w:r>
-      <w:r>
-        <w:rPr>
-          <w:b w:val="false"/>
-          <w:bCs w:val="false"/>
-        </w:rPr>
-        <w:t xml:space="preserve">.</w:t>
-      </w:r>
-    </w:p>
-    <w:p>
-      <w:pPr>
-        <w:spacing w:after="100"/>
-        <w:ind w:left="360"/>
-      </w:pPr>
-      <w:r>
-        <w:rPr>
-          <w:b/>
-          <w:bCs/>
-          <w:color w:val="0F766E"/>
-        </w:rPr>
-        <w:t xml:space="preserve">Bước 2. </w:t>
-      </w:r>
-      <w:r>
-        <w:rPr>
-          <w:b w:val="false"/>
-          <w:bCs w:val="false"/>
-        </w:rPr>
-        <w:t xml:space="preserve">Mở </w:t>
-      </w:r>
-      <w:r>
-        <w:rPr>
-          <w:b/>
-          <w:bCs/>
-          <w:color w:val="0F172A"/>
-        </w:rPr>
-        <w:t xml:space="preserve">Thùng rác</w:t>
-      </w:r>
-      <w:r>
-        <w:rPr>
-          <w:b w:val="false"/>
-          <w:bCs w:val="false"/>
-        </w:rPr>
-        <w:t xml:space="preserve">, chọn loại, bấm </w:t>
-      </w:r>
-      <w:r>
-        <w:rPr>
-          <w:b/>
-          <w:bCs/>
-          <w:color w:val="0F172A"/>
-        </w:rPr>
-        <w:t xml:space="preserve">Khôi phục</w:t>
-      </w:r>
-      <w:r>
-        <w:rPr>
-          <w:b w:val="false"/>
-          <w:bCs w:val="false"/>
-        </w:rPr>
-        <w:t xml:space="preserve"> để lấy lại.</w:t>
-      </w:r>
-    </w:p>
-    <w:p>
-      <w:pPr>
         <w:spacing w:after="80"/>
         <w:ind w:left="360"/>
       </w:pPr>
@@ -4672,14 +4505,53 @@
           <w:bCs/>
           <w:color w:val="0F766E"/>
         </w:rPr>
-        <w:t xml:space="preserve">Bước 3. </w:t>
-      </w:r>
-      <w:r>
-        <w:rPr>
-          <w:b w:val="false"/>
-          <w:bCs w:val="false"/>
-        </w:rPr>
-        <w:t xml:space="preserve">Khôi phục ca hoặc lần thu cần học sinh và môn của nó còn tồn tại.</w:t>
+        <w:t xml:space="preserve">Bước 4. </w:t>
+      </w:r>
+      <w:r>
+        <w:rPr>
+          <w:b w:val="false"/>
+          <w:bCs w:val="false"/>
+        </w:rPr>
+        <w:t xml:space="preserve">Chọn </w:t>
+      </w:r>
+      <w:r>
+        <w:rPr>
+          <w:b/>
+          <w:bCs/>
+          <w:color w:val="0F172A"/>
+        </w:rPr>
+        <w:t xml:space="preserve">Chuyển khoản, chờ admin duyệt</w:t>
+      </w:r>
+      <w:r>
+        <w:rPr>
+          <w:b w:val="false"/>
+          <w:bCs w:val="false"/>
+        </w:rPr>
+        <w:t xml:space="preserve">: chuyển khoản đúng nội dung mã đơn, rồi báo chủ app (Gọi, Zalo, Facebook ngay trên thẻ đơn). Gói được kích hoạt sau khi quản trị viên xác nhận.</w:t>
+      </w:r>
+    </w:p>
+    <w:p>
+      <w:pPr>
+        <w:pBdr>
+          <w:left w:val="single" w:color="D97706" w:sz="18" w:space="6"/>
+        </w:pBdr>
+        <w:shd w:fill="FEF3C7" w:color="auto" w:val="clear"/>
+        <w:spacing w:after="60" w:before="60"/>
+        <w:ind w:left="360"/>
+      </w:pPr>
+      <w:r>
+        <w:rPr>
+          <w:b/>
+          <w:bCs/>
+        </w:rPr>
+        <w:t xml:space="preserve">Mẹo: </w:t>
+      </w:r>
+      <w:r>
+        <w:rPr>
+          <w:b w:val="false"/>
+          <w:bCs w:val="false"/>
+        </w:rPr>
+        <w:t xml:space="preserve">Gia hạn sớm trước khi hết hạn được tặng thêm tháng.</w:t>
       </w:r>
     </w:p>
     <w:p>
@@ -4699,7 +4571,7 @@
           <w:sz w:val="32"/>
           <w:szCs w:val="32"/>
         </w:rPr>
-        <w:t xml:space="preserve">12. Sao lưu Excel</w:t>
+        <w:t xml:space="preserve">11. Thùng rác</w:t>
       </w:r>
     </w:p>
     <w:p>
@@ -4720,15 +4592,15 @@
           <w:b w:val="false"/>
           <w:bCs w:val="false"/>
         </w:rPr>
-        <w:t xml:space="preserve">Bấm avatar góc phải trên, chọn </w:t>
-      </w:r>
-      <w:r>
-        <w:rPr>
-          <w:b/>
-          <w:bCs/>
-          <w:color w:val="0F172A"/>
-        </w:rPr>
-        <w:t xml:space="preserve">Sao lưu dữ liệu</w:t>
+        <w:t xml:space="preserve">Học sinh, môn, ca dạy, lần thu đã xoá đều vào </w:t>
+      </w:r>
+      <w:r>
+        <w:rPr>
+          <w:b/>
+          <w:bCs/>
+          <w:color w:val="0F172A"/>
+        </w:rPr>
+        <w:t xml:space="preserve">Thùng rác</w:t>
       </w:r>
       <w:r>
         <w:rPr>
@@ -4736,6 +4608,57 @@
           <w:bCs w:val="false"/>
         </w:rPr>
         <w:t xml:space="preserve">.</w:t>
+      </w:r>
+    </w:p>
+    <w:p>
+      <w:pPr>
+        <w:spacing w:after="100"/>
+        <w:ind w:left="360"/>
+      </w:pPr>
+      <w:r>
+        <w:rPr>
+          <w:b/>
+          <w:bCs/>
+          <w:color w:val="0F766E"/>
+        </w:rPr>
+        <w:t xml:space="preserve">Bước 2. </w:t>
+      </w:r>
+      <w:r>
+        <w:rPr>
+          <w:b w:val="false"/>
+          <w:bCs w:val="false"/>
+        </w:rPr>
+        <w:t xml:space="preserve">Mở </w:t>
+      </w:r>
+      <w:r>
+        <w:rPr>
+          <w:b/>
+          <w:bCs/>
+          <w:color w:val="0F172A"/>
+        </w:rPr>
+        <w:t xml:space="preserve">Thùng rác</w:t>
+      </w:r>
+      <w:r>
+        <w:rPr>
+          <w:b w:val="false"/>
+          <w:bCs w:val="false"/>
+        </w:rPr>
+        <w:t xml:space="preserve">, chọn loại, bấm </w:t>
+      </w:r>
+      <w:r>
+        <w:rPr>
+          <w:b/>
+          <w:bCs/>
+          <w:color w:val="0F172A"/>
+        </w:rPr>
+        <w:t xml:space="preserve">Khôi phục</w:t>
+      </w:r>
+      <w:r>
+        <w:rPr>
+          <w:b w:val="false"/>
+          <w:bCs w:val="false"/>
+        </w:rPr>
+        <w:t xml:space="preserve"> để lấy lại.</w:t>
       </w:r>
     </w:p>
     <w:p>
@@ -4841,14 +4764,34 @@
           <w:bCs/>
           <w:color w:val="0F766E"/>
         </w:rPr>
-        <w:t xml:space="preserve">Bước 2. </w:t>
-      </w:r>
-      <w:r>
-        <w:rPr>
-          <w:b w:val="false"/>
-          <w:bCs w:val="false"/>
-        </w:rPr>
-        <w:t xml:space="preserve">Đọc cảnh báo: file sao lưu không mã hoá, chỉ lưu ở nơi an toàn.</w:t>
+        <w:t xml:space="preserve">Bước 3. </w:t>
+      </w:r>
+      <w:r>
+        <w:rPr>
+          <w:b w:val="false"/>
+          <w:bCs w:val="false"/>
+        </w:rPr>
+        <w:t xml:space="preserve">Khôi phục ca hoặc lần thu cần học sinh và môn của nó còn tồn tại.</w:t>
+      </w:r>
+    </w:p>
+    <w:p>
+      <w:pPr>
+        <w:pStyle w:val="Heading1"/>
+        <w:pBdr>
+          <w:bottom w:val="single" w:color="0F766E" w:sz="12" w:space="4"/>
+        </w:pBdr>
+        <w:shd w:fill="E6F4F1" w:color="auto" w:val="clear"/>
+        <w:spacing w:after="160" w:before="360"/>
+      </w:pPr>
+      <w:r>
+        <w:rPr>
+          <w:b/>
+          <w:bCs/>
+          <w:color w:val="0F766E"/>
+          <w:sz w:val="32"/>
+          <w:szCs w:val="32"/>
+        </w:rPr>
+        <w:t xml:space="preserve">12. Sao lưu Excel</w:t>
       </w:r>
     </w:p>
     <w:p>
@@ -4862,29 +4805,29 @@
           <w:bCs/>
           <w:color w:val="0F766E"/>
         </w:rPr>
-        <w:t xml:space="preserve">Bước 3. </w:t>
-      </w:r>
-      <w:r>
-        <w:rPr>
-          <w:b w:val="false"/>
-          <w:bCs w:val="false"/>
-        </w:rPr>
-        <w:t xml:space="preserve">Bấm </w:t>
-      </w:r>
-      <w:r>
-        <w:rPr>
-          <w:b/>
-          <w:bCs/>
-          <w:color w:val="0F172A"/>
-        </w:rPr>
-        <w:t xml:space="preserve">Tôi hiểu, tải xuống</w:t>
-      </w:r>
-      <w:r>
-        <w:rPr>
-          <w:b w:val="false"/>
-          <w:bCs w:val="false"/>
-        </w:rPr>
-        <w:t xml:space="preserve"> để tải file Excel chứa toàn bộ dữ liệu của bạn.</w:t>
+        <w:t xml:space="preserve">Bước 1. </w:t>
+      </w:r>
+      <w:r>
+        <w:rPr>
+          <w:b w:val="false"/>
+          <w:bCs w:val="false"/>
+        </w:rPr>
+        <w:t xml:space="preserve">Bấm avatar góc phải trên, chọn </w:t>
+      </w:r>
+      <w:r>
+        <w:rPr>
+          <w:b/>
+          <w:bCs/>
+          <w:color w:val="0F172A"/>
+        </w:rPr>
+        <w:t xml:space="preserve">Sao lưu dữ liệu</w:t>
+      </w:r>
+      <w:r>
+        <w:rPr>
+          <w:b w:val="false"/>
+          <w:bCs w:val="false"/>
+        </w:rPr>
+        <w:t xml:space="preserve">.</w:t>
       </w:r>
     </w:p>
     <w:p>
@@ -4958,6 +4901,155 @@
                   </pic:nvPicPr>
                   <pic:blipFill>
                     <a:blip r:embed="rId54" cstate="none"/>
+                    <a:srcRect/>
+                    <a:stretch>
+                      <a:fillRect/>
+                    </a:stretch>
+                  </pic:blipFill>
+                  <pic:spPr bwMode="auto">
+                    <a:xfrm>
+                      <a:off x="0" y="0"/>
+                      <a:ext cx="1581150" cy="3429000"/>
+                    </a:xfrm>
+                    <a:prstGeom prst="rect">
+                      <a:avLst/>
+                    </a:prstGeom>
+                  </pic:spPr>
+                </pic:pic>
+              </a:graphicData>
+            </a:graphic>
+          </wp:inline>
+        </w:drawing>
+      </w:r>
+    </w:p>
+    <w:p>
+      <w:pPr>
+        <w:spacing w:after="100"/>
+        <w:ind w:left="360"/>
+      </w:pPr>
+      <w:r>
+        <w:rPr>
+          <w:b/>
+          <w:bCs/>
+          <w:color w:val="0F766E"/>
+        </w:rPr>
+        <w:t xml:space="preserve">Bước 2. </w:t>
+      </w:r>
+      <w:r>
+        <w:rPr>
+          <w:b w:val="false"/>
+          <w:bCs w:val="false"/>
+        </w:rPr>
+        <w:t xml:space="preserve">Đọc cảnh báo: file sao lưu không mã hoá, chỉ lưu ở nơi an toàn.</w:t>
+      </w:r>
+    </w:p>
+    <w:p>
+      <w:pPr>
+        <w:spacing w:after="100"/>
+        <w:ind w:left="360"/>
+      </w:pPr>
+      <w:r>
+        <w:rPr>
+          <w:b/>
+          <w:bCs/>
+          <w:color w:val="0F766E"/>
+        </w:rPr>
+        <w:t xml:space="preserve">Bước 3. </w:t>
+      </w:r>
+      <w:r>
+        <w:rPr>
+          <w:b w:val="false"/>
+          <w:bCs w:val="false"/>
+        </w:rPr>
+        <w:t xml:space="preserve">Bấm </w:t>
+      </w:r>
+      <w:r>
+        <w:rPr>
+          <w:b/>
+          <w:bCs/>
+          <w:color w:val="0F172A"/>
+        </w:rPr>
+        <w:t xml:space="preserve">Tôi hiểu, tải xuống</w:t>
+      </w:r>
+      <w:r>
+        <w:rPr>
+          <w:b w:val="false"/>
+          <w:bCs w:val="false"/>
+        </w:rPr>
+        <w:t xml:space="preserve"> để tải file Excel chứa toàn bộ dữ liệu của bạn.</w:t>
+      </w:r>
+    </w:p>
+    <w:p>
+      <w:pPr>
+        <w:spacing w:after="80"/>
+        <w:ind w:left="360"/>
+      </w:pPr>
+      <w:r>
+        <w:drawing>
+          <wp:inline distT="0" distB="0" distL="0" distR="0">
+            <wp:extent cx="5486400" cy="3429000"/>
+            <wp:effectExtent t="0" r="0" b="0" l="0"/>
+            <wp:docPr id="49" name="" descr="" title=""/>
+            <wp:cNvGraphicFramePr>
+              <a:graphicFrameLocks xmlns:a="http://schemas.openxmlformats.org/drawingml/2006/main" noChangeAspect="1"/>
+            </wp:cNvGraphicFramePr>
+            <a:graphic xmlns:a="http://schemas.openxmlformats.org/drawingml/2006/main">
+              <a:graphicData uri="http://schemas.openxmlformats.org/drawingml/2006/picture">
+                <pic:pic xmlns:pic="http://schemas.openxmlformats.org/drawingml/2006/picture">
+                  <pic:nvPicPr>
+                    <pic:cNvPr id="0" name="" descr=""/>
+                    <pic:cNvPicPr>
+                      <a:picLocks noChangeAspect="1" noChangeArrowheads="1"/>
+                    </pic:cNvPicPr>
+                  </pic:nvPicPr>
+                  <pic:blipFill>
+                    <a:blip r:embed="rId55" cstate="none"/>
+                    <a:srcRect/>
+                    <a:stretch>
+                      <a:fillRect/>
+                    </a:stretch>
+                  </pic:blipFill>
+                  <pic:spPr bwMode="auto">
+                    <a:xfrm>
+                      <a:off x="0" y="0"/>
+                      <a:ext cx="5486400" cy="3429000"/>
+                    </a:xfrm>
+                    <a:prstGeom prst="rect">
+                      <a:avLst/>
+                    </a:prstGeom>
+                  </pic:spPr>
+                </pic:pic>
+              </a:graphicData>
+            </a:graphic>
+          </wp:inline>
+        </w:drawing>
+      </w:r>
+    </w:p>
+    <w:p>
+      <w:pPr>
+        <w:spacing w:after="160"/>
+        <w:ind w:left="360"/>
+      </w:pPr>
+      <w:r>
+        <w:drawing>
+          <wp:inline distT="0" distB="0" distL="0" distR="0">
+            <wp:extent cx="1581150" cy="3429000"/>
+            <wp:effectExtent t="0" r="0" b="0" l="0"/>
+            <wp:docPr id="50" name="" descr="" title=""/>
+            <wp:cNvGraphicFramePr>
+              <a:graphicFrameLocks xmlns:a="http://schemas.openxmlformats.org/drawingml/2006/main" noChangeAspect="1"/>
+            </wp:cNvGraphicFramePr>
+            <a:graphic xmlns:a="http://schemas.openxmlformats.org/drawingml/2006/main">
+              <a:graphicData uri="http://schemas.openxmlformats.org/drawingml/2006/picture">
+                <pic:pic xmlns:pic="http://schemas.openxmlformats.org/drawingml/2006/picture">
+                  <pic:nvPicPr>
+                    <pic:cNvPr id="0" name="" descr=""/>
+                    <pic:cNvPicPr>
+                      <a:picLocks noChangeAspect="1" noChangeArrowheads="1"/>
+                    </pic:cNvPicPr>
+                  </pic:nvPicPr>
+                  <pic:blipFill>
+                    <a:blip r:embed="rId56" cstate="none"/>
                     <a:srcRect/>
                     <a:stretch>
                       <a:fillRect/>

</xml_diff>

<commit_message>
docs(ah): hướng dẫn cài payOS tự đánh dấu học phí + ảnh app
</commit_message>
<xml_diff>
--- a/public/guide/huong-dan-su-dung.docx
+++ b/public/guide/huong-dan-su-dung.docx
@@ -123,7 +123,7 @@
         <w:spacing w:after="40"/>
       </w:pPr>
       <w:r>
-        <w:t xml:space="preserve">10. Gói dịch vụ</w:t>
+        <w:t xml:space="preserve">10. Tự đánh dấu học phí bằng payOS (gói Pro)</w:t>
       </w:r>
     </w:p>
     <w:p>
@@ -131,7 +131,7 @@
         <w:spacing w:after="40"/>
       </w:pPr>
       <w:r>
-        <w:t xml:space="preserve">11. Thùng rác</w:t>
+        <w:t xml:space="preserve">11. Gói dịch vụ</w:t>
       </w:r>
     </w:p>
     <w:p>
@@ -139,7 +139,7 @@
         <w:spacing w:after="40"/>
       </w:pPr>
       <w:r>
-        <w:t xml:space="preserve">12. Sao lưu Excel</w:t>
+        <w:t xml:space="preserve">12. Thùng rác</w:t>
       </w:r>
     </w:p>
     <w:p>
@@ -147,7 +147,15 @@
         <w:spacing w:after="40"/>
       </w:pPr>
       <w:r>
-        <w:t xml:space="preserve">13. Bảo mật dữ liệu</w:t>
+        <w:t xml:space="preserve">13. Sao lưu Excel</w:t>
+      </w:r>
+    </w:p>
+    <w:p>
+      <w:pPr>
+        <w:spacing w:after="40"/>
+      </w:pPr>
+      <w:r>
+        <w:t xml:space="preserve">14. Bảo mật dữ liệu</w:t>
       </w:r>
     </w:p>
     <w:p>
@@ -4199,7 +4207,42 @@
           <w:sz w:val="32"/>
           <w:szCs w:val="32"/>
         </w:rPr>
-        <w:t xml:space="preserve">10. Gói dịch vụ</w:t>
+        <w:t xml:space="preserve">10. Tự đánh dấu học phí bằng payOS (gói Pro)</w:t>
+      </w:r>
+    </w:p>
+    <w:p>
+      <w:pPr>
+        <w:spacing w:after="120"/>
+      </w:pPr>
+      <w:r>
+        <w:rPr>
+          <w:b w:val="false"/>
+          <w:bCs w:val="false"/>
+          <w:i/>
+          <w:iCs/>
+          <w:color w:val="334155"/>
+        </w:rPr>
+        <w:t xml:space="preserve">Phụ huynh quét QR payOS trên phiếu, tiền vào là app tự ghi khoản thu và đánh dấu </w:t>
+      </w:r>
+      <w:r>
+        <w:rPr>
+          <w:b/>
+          <w:bCs/>
+          <w:i/>
+          <w:iCs/>
+          <w:color w:val="0F172A"/>
+        </w:rPr>
+        <w:t xml:space="preserve">Đã đóng đủ</w:t>
+      </w:r>
+      <w:r>
+        <w:rPr>
+          <w:b w:val="false"/>
+          <w:bCs w:val="false"/>
+          <w:i/>
+          <w:iCs/>
+          <w:color w:val="334155"/>
+        </w:rPr>
+        <w:t xml:space="preserve">, không phải rà sao kê rồi đánh dấu tay. Dùng payOS: 100 giao dịch miễn phí trọn đời + 500 miễn phí trong 6 tháng; muốn nhiều hơn (1.000 giao dịch/năm) phải mua gói Pro của payOS ~2.000đ/giao dịch ≈ 2 triệu/năm. Không cần tự đánh dấu thì cứ dùng VietQR miễn phí trọn đời như bình thường.</w:t>
       </w:r>
     </w:p>
     <w:p>
@@ -4220,22 +4263,247 @@
           <w:b w:val="false"/>
           <w:bCs w:val="false"/>
         </w:rPr>
-        <w:t xml:space="preserve">Mở </w:t>
-      </w:r>
-      <w:r>
-        <w:rPr>
-          <w:b/>
-          <w:bCs/>
-          <w:color w:val="0F172A"/>
-        </w:rPr>
-        <w:t xml:space="preserve">Gói của tôi</w:t>
-      </w:r>
-      <w:r>
-        <w:rPr>
-          <w:b w:val="false"/>
-          <w:bCs w:val="false"/>
-        </w:rPr>
-        <w:t xml:space="preserve"> để xem gói đang dùng, hạn dùng và tính năng của từng gói Standard, Plus, Pro.</w:t>
+        <w:t xml:space="preserve">Đăng ký tài khoản tại </w:t>
+      </w:r>
+      <w:r>
+        <w:rPr>
+          <w:b/>
+          <w:bCs/>
+          <w:color w:val="0F172A"/>
+        </w:rPr>
+        <w:t xml:space="preserve">payos.vn</w:t>
+      </w:r>
+      <w:r>
+        <w:rPr>
+          <w:b w:val="false"/>
+          <w:bCs w:val="false"/>
+        </w:rPr>
+        <w:t xml:space="preserve"> và xác thực danh tính theo hướng dẫn của payOS.</w:t>
+      </w:r>
+    </w:p>
+    <w:p>
+      <w:pPr>
+        <w:spacing w:after="100"/>
+        <w:ind w:left="360"/>
+      </w:pPr>
+      <w:r>
+        <w:rPr>
+          <w:b/>
+          <w:bCs/>
+          <w:color w:val="0F766E"/>
+        </w:rPr>
+        <w:t xml:space="preserve">Bước 2. </w:t>
+      </w:r>
+      <w:r>
+        <w:rPr>
+          <w:b w:val="false"/>
+          <w:bCs w:val="false"/>
+        </w:rPr>
+        <w:t xml:space="preserve">Liên kết tài khoản ngân hàng nhận học phí (nên chọn ngân hàng payOS hỗ trợ liên kết).</w:t>
+      </w:r>
+    </w:p>
+    <w:p>
+      <w:pPr>
+        <w:spacing w:after="100"/>
+        <w:ind w:left="360"/>
+      </w:pPr>
+      <w:r>
+        <w:rPr>
+          <w:b/>
+          <w:bCs/>
+          <w:color w:val="0F766E"/>
+        </w:rPr>
+        <w:t xml:space="preserve">Bước 3. </w:t>
+      </w:r>
+      <w:r>
+        <w:rPr>
+          <w:b w:val="false"/>
+          <w:bCs w:val="false"/>
+        </w:rPr>
+        <w:t xml:space="preserve">Tạo một </w:t>
+      </w:r>
+      <w:r>
+        <w:rPr>
+          <w:b/>
+          <w:bCs/>
+          <w:color w:val="0F172A"/>
+        </w:rPr>
+        <w:t xml:space="preserve">kênh thanh toán riêng</w:t>
+      </w:r>
+      <w:r>
+        <w:rPr>
+          <w:b w:val="false"/>
+          <w:bCs w:val="false"/>
+        </w:rPr>
+        <w:t xml:space="preserve"> cho học phí.</w:t>
+      </w:r>
+    </w:p>
+    <w:p>
+      <w:pPr>
+        <w:spacing w:after="100"/>
+        <w:ind w:left="360"/>
+      </w:pPr>
+      <w:r>
+        <w:rPr>
+          <w:b/>
+          <w:bCs/>
+          <w:color w:val="0F766E"/>
+        </w:rPr>
+        <w:t xml:space="preserve">Bước 4. </w:t>
+      </w:r>
+      <w:r>
+        <w:rPr>
+          <w:b w:val="false"/>
+          <w:bCs w:val="false"/>
+        </w:rPr>
+        <w:t xml:space="preserve">Kênh vừa tạo hiện trong danh sách kênh.</w:t>
+      </w:r>
+    </w:p>
+    <w:p>
+      <w:pPr>
+        <w:spacing w:after="100"/>
+        <w:ind w:left="360"/>
+      </w:pPr>
+      <w:r>
+        <w:rPr>
+          <w:b/>
+          <w:bCs/>
+          <w:color w:val="0F766E"/>
+        </w:rPr>
+        <w:t xml:space="preserve">Bước 5. </w:t>
+      </w:r>
+      <w:r>
+        <w:rPr>
+          <w:b w:val="false"/>
+          <w:bCs w:val="false"/>
+        </w:rPr>
+        <w:t xml:space="preserve">Mở kênh, vào tab </w:t>
+      </w:r>
+      <w:r>
+        <w:rPr>
+          <w:b/>
+          <w:bCs/>
+          <w:color w:val="0F172A"/>
+        </w:rPr>
+        <w:t xml:space="preserve">Thông tin tích hợp</w:t>
+      </w:r>
+      <w:r>
+        <w:rPr>
+          <w:b w:val="false"/>
+          <w:bCs w:val="false"/>
+        </w:rPr>
+        <w:t xml:space="preserve">, chép </w:t>
+      </w:r>
+      <w:r>
+        <w:rPr>
+          <w:b/>
+          <w:bCs/>
+          <w:color w:val="0F172A"/>
+        </w:rPr>
+        <w:t xml:space="preserve">Client ID</w:t>
+      </w:r>
+      <w:r>
+        <w:rPr>
+          <w:b w:val="false"/>
+          <w:bCs w:val="false"/>
+        </w:rPr>
+        <w:t xml:space="preserve">, </w:t>
+      </w:r>
+      <w:r>
+        <w:rPr>
+          <w:b/>
+          <w:bCs/>
+          <w:color w:val="0F172A"/>
+        </w:rPr>
+        <w:t xml:space="preserve">API Key</w:t>
+      </w:r>
+      <w:r>
+        <w:rPr>
+          <w:b w:val="false"/>
+          <w:bCs w:val="false"/>
+        </w:rPr>
+        <w:t xml:space="preserve">, </w:t>
+      </w:r>
+      <w:r>
+        <w:rPr>
+          <w:b/>
+          <w:bCs/>
+          <w:color w:val="0F172A"/>
+        </w:rPr>
+        <w:t xml:space="preserve">Checksum Key</w:t>
+      </w:r>
+      <w:r>
+        <w:rPr>
+          <w:b w:val="false"/>
+          <w:bCs w:val="false"/>
+        </w:rPr>
+        <w:t xml:space="preserve">. Không bấm nút ↻ cạnh Checksum Key (đổi khoá làm app mất kết nối). Không cần tự điền webhook, app tự cài.</w:t>
+      </w:r>
+    </w:p>
+    <w:p>
+      <w:pPr>
+        <w:spacing w:after="100"/>
+        <w:ind w:left="360"/>
+      </w:pPr>
+      <w:r>
+        <w:rPr>
+          <w:b/>
+          <w:bCs/>
+          <w:color w:val="0F766E"/>
+        </w:rPr>
+        <w:t xml:space="preserve">Bước 6. </w:t>
+      </w:r>
+      <w:r>
+        <w:rPr>
+          <w:b w:val="false"/>
+          <w:bCs w:val="false"/>
+        </w:rPr>
+        <w:t xml:space="preserve">Trong app: </w:t>
+      </w:r>
+      <w:r>
+        <w:rPr>
+          <w:b/>
+          <w:bCs/>
+          <w:color w:val="0F172A"/>
+        </w:rPr>
+        <w:t xml:space="preserve">Cài đặt</w:t>
+      </w:r>
+      <w:r>
+        <w:rPr>
+          <w:b w:val="false"/>
+          <w:bCs w:val="false"/>
+        </w:rPr>
+        <w:t xml:space="preserve">, thẻ </w:t>
+      </w:r>
+      <w:r>
+        <w:rPr>
+          <w:b/>
+          <w:bCs/>
+          <w:color w:val="0F172A"/>
+        </w:rPr>
+        <w:t xml:space="preserve">Tự đánh dấu học phí bằng payOS</w:t>
+      </w:r>
+      <w:r>
+        <w:rPr>
+          <w:b w:val="false"/>
+          <w:bCs w:val="false"/>
+        </w:rPr>
+        <w:t xml:space="preserve">, dán 3 khoá rồi bấm </w:t>
+      </w:r>
+      <w:r>
+        <w:rPr>
+          <w:b/>
+          <w:bCs/>
+          <w:color w:val="0F172A"/>
+        </w:rPr>
+        <w:t xml:space="preserve">Kết nối</w:t>
+      </w:r>
+      <w:r>
+        <w:rPr>
+          <w:b w:val="false"/>
+          <w:bCs w:val="false"/>
+        </w:rPr>
+        <w:t xml:space="preserve">.</w:t>
       </w:r>
     </w:p>
     <w:p>
@@ -4341,65 +4609,14 @@
           <w:bCs/>
           <w:color w:val="0F766E"/>
         </w:rPr>
-        <w:t xml:space="preserve">Bước 2. </w:t>
-      </w:r>
-      <w:r>
-        <w:rPr>
-          <w:b w:val="false"/>
-          <w:bCs w:val="false"/>
-        </w:rPr>
-        <w:t xml:space="preserve">Bấm mua hoặc gia hạn, chọn thời hạn và cách thanh toán rồi bấm </w:t>
-      </w:r>
-      <w:r>
-        <w:rPr>
-          <w:b/>
-          <w:bCs/>
-          <w:color w:val="0F172A"/>
-        </w:rPr>
-        <w:t xml:space="preserve">Tạo đơn</w:t>
-      </w:r>
-      <w:r>
-        <w:rPr>
-          <w:b w:val="false"/>
-          <w:bCs w:val="false"/>
-        </w:rPr>
-        <w:t xml:space="preserve">. App hiện mã QR, mã đơn và số tiền.</w:t>
-      </w:r>
-    </w:p>
-    <w:p>
-      <w:pPr>
-        <w:spacing w:after="100"/>
-        <w:ind w:left="360"/>
-      </w:pPr>
-      <w:r>
-        <w:rPr>
-          <w:b/>
-          <w:bCs/>
-          <w:color w:val="0F766E"/>
-        </w:rPr>
-        <w:t xml:space="preserve">Bước 3. </w:t>
-      </w:r>
-      <w:r>
-        <w:rPr>
-          <w:b w:val="false"/>
-          <w:bCs w:val="false"/>
-        </w:rPr>
-        <w:t xml:space="preserve">Chọn </w:t>
-      </w:r>
-      <w:r>
-        <w:rPr>
-          <w:b/>
-          <w:bCs/>
-          <w:color w:val="0F172A"/>
-        </w:rPr>
-        <w:t xml:space="preserve">Kích hoạt ngay sau khi chuyển khoản</w:t>
-      </w:r>
-      <w:r>
-        <w:rPr>
-          <w:b w:val="false"/>
-          <w:bCs w:val="false"/>
-        </w:rPr>
-        <w:t xml:space="preserve">: quét QR payOS, gói bật trong vài giây khi tiền vào, không phải chờ duyệt.</w:t>
+        <w:t xml:space="preserve">Bước 7. </w:t>
+      </w:r>
+      <w:r>
+        <w:rPr>
+          <w:b w:val="false"/>
+          <w:bCs w:val="false"/>
+        </w:rPr>
+        <w:t xml:space="preserve">Gửi phiếu như thường: phiếu có QR payOS đúng số đang nợ, phụ huynh quét để trả.</w:t>
       </w:r>
     </w:p>
     <w:p>
@@ -4505,102 +4722,37 @@
           <w:bCs/>
           <w:color w:val="0F766E"/>
         </w:rPr>
-        <w:t xml:space="preserve">Bước 4. </w:t>
-      </w:r>
-      <w:r>
-        <w:rPr>
-          <w:b w:val="false"/>
-          <w:bCs w:val="false"/>
-        </w:rPr>
-        <w:t xml:space="preserve">Chọn </w:t>
-      </w:r>
-      <w:r>
-        <w:rPr>
-          <w:b/>
-          <w:bCs/>
-          <w:color w:val="0F172A"/>
-        </w:rPr>
-        <w:t xml:space="preserve">Chuyển khoản, chờ admin duyệt</w:t>
-      </w:r>
-      <w:r>
-        <w:rPr>
-          <w:b w:val="false"/>
-          <w:bCs w:val="false"/>
-        </w:rPr>
-        <w:t xml:space="preserve">: chuyển khoản đúng nội dung mã đơn, rồi báo chủ app (Gọi, Zalo, Facebook ngay trên thẻ đơn). Gói được kích hoạt sau khi quản trị viên xác nhận.</w:t>
-      </w:r>
-    </w:p>
-    <w:p>
-      <w:pPr>
-        <w:pBdr>
-          <w:left w:val="single" w:color="D97706" w:sz="18" w:space="6"/>
-        </w:pBdr>
-        <w:shd w:fill="FEF3C7" w:color="auto" w:val="clear"/>
-        <w:spacing w:after="60" w:before="60"/>
-        <w:ind w:left="360"/>
-      </w:pPr>
-      <w:r>
-        <w:rPr>
-          <w:b/>
-          <w:bCs/>
-        </w:rPr>
-        <w:t xml:space="preserve">Mẹo: </w:t>
-      </w:r>
-      <w:r>
-        <w:rPr>
-          <w:b w:val="false"/>
-          <w:bCs w:val="false"/>
-        </w:rPr>
-        <w:t xml:space="preserve">Gia hạn sớm trước khi hết hạn được tặng thêm tháng.</w:t>
-      </w:r>
-    </w:p>
-    <w:p>
-      <w:pPr>
-        <w:pStyle w:val="Heading1"/>
-        <w:pBdr>
-          <w:bottom w:val="single" w:color="0F766E" w:sz="12" w:space="4"/>
-        </w:pBdr>
-        <w:shd w:fill="E6F4F1" w:color="auto" w:val="clear"/>
-        <w:spacing w:after="160" w:before="360"/>
-      </w:pPr>
-      <w:r>
-        <w:rPr>
-          <w:b/>
-          <w:bCs/>
-          <w:color w:val="0F766E"/>
-          <w:sz w:val="32"/>
-          <w:szCs w:val="32"/>
-        </w:rPr>
-        <w:t xml:space="preserve">11. Thùng rác</w:t>
-      </w:r>
-    </w:p>
-    <w:p>
-      <w:pPr>
-        <w:spacing w:after="100"/>
-        <w:ind w:left="360"/>
-      </w:pPr>
-      <w:r>
-        <w:rPr>
-          <w:b/>
-          <w:bCs/>
-          <w:color w:val="0F766E"/>
-        </w:rPr>
-        <w:t xml:space="preserve">Bước 1. </w:t>
-      </w:r>
-      <w:r>
-        <w:rPr>
-          <w:b w:val="false"/>
-          <w:bCs w:val="false"/>
-        </w:rPr>
-        <w:t xml:space="preserve">Học sinh, môn, ca dạy, lần thu đã xoá đều vào </w:t>
-      </w:r>
-      <w:r>
-        <w:rPr>
-          <w:b/>
-          <w:bCs/>
-          <w:color w:val="0F172A"/>
-        </w:rPr>
-        <w:t xml:space="preserve">Thùng rác</w:t>
+        <w:t xml:space="preserve">Bước 8. </w:t>
+      </w:r>
+      <w:r>
+        <w:rPr>
+          <w:b w:val="false"/>
+          <w:bCs w:val="false"/>
+        </w:rPr>
+        <w:t xml:space="preserve">Tiền vào: tháng tự thành </w:t>
+      </w:r>
+      <w:r>
+        <w:rPr>
+          <w:b/>
+          <w:bCs/>
+          <w:color w:val="0F172A"/>
+        </w:rPr>
+        <w:t xml:space="preserve">Đã đóng đủ</w:t>
+      </w:r>
+      <w:r>
+        <w:rPr>
+          <w:b w:val="false"/>
+          <w:bCs w:val="false"/>
+        </w:rPr>
+        <w:t xml:space="preserve">, huy hiệu hiện </w:t>
+      </w:r>
+      <w:r>
+        <w:rPr>
+          <w:b/>
+          <w:bCs/>
+          <w:color w:val="0F172A"/>
+        </w:rPr>
+        <w:t xml:space="preserve">PH đã chuyển … lúc … ngày …</w:t>
       </w:r>
       <w:r>
         <w:rPr>
@@ -4608,57 +4760,6 @@
           <w:bCs w:val="false"/>
         </w:rPr>
         <w:t xml:space="preserve">.</w:t>
-      </w:r>
-    </w:p>
-    <w:p>
-      <w:pPr>
-        <w:spacing w:after="100"/>
-        <w:ind w:left="360"/>
-      </w:pPr>
-      <w:r>
-        <w:rPr>
-          <w:b/>
-          <w:bCs/>
-          <w:color w:val="0F766E"/>
-        </w:rPr>
-        <w:t xml:space="preserve">Bước 2. </w:t>
-      </w:r>
-      <w:r>
-        <w:rPr>
-          <w:b w:val="false"/>
-          <w:bCs w:val="false"/>
-        </w:rPr>
-        <w:t xml:space="preserve">Mở </w:t>
-      </w:r>
-      <w:r>
-        <w:rPr>
-          <w:b/>
-          <w:bCs/>
-          <w:color w:val="0F172A"/>
-        </w:rPr>
-        <w:t xml:space="preserve">Thùng rác</w:t>
-      </w:r>
-      <w:r>
-        <w:rPr>
-          <w:b w:val="false"/>
-          <w:bCs w:val="false"/>
-        </w:rPr>
-        <w:t xml:space="preserve">, chọn loại, bấm </w:t>
-      </w:r>
-      <w:r>
-        <w:rPr>
-          <w:b/>
-          <w:bCs/>
-          <w:color w:val="0F172A"/>
-        </w:rPr>
-        <w:t xml:space="preserve">Khôi phục</w:t>
-      </w:r>
-      <w:r>
-        <w:rPr>
-          <w:b w:val="false"/>
-          <w:bCs w:val="false"/>
-        </w:rPr>
-        <w:t xml:space="preserve"> để lấy lại.</w:t>
       </w:r>
     </w:p>
     <w:p>
@@ -4755,23 +4856,41 @@
     </w:p>
     <w:p>
       <w:pPr>
-        <w:spacing w:after="100"/>
-        <w:ind w:left="360"/>
-      </w:pPr>
-      <w:r>
-        <w:rPr>
-          <w:b/>
-          <w:bCs/>
-          <w:color w:val="0F766E"/>
-        </w:rPr>
-        <w:t xml:space="preserve">Bước 3. </w:t>
-      </w:r>
-      <w:r>
-        <w:rPr>
-          <w:b w:val="false"/>
-          <w:bCs w:val="false"/>
-        </w:rPr>
-        <w:t xml:space="preserve">Khôi phục ca hoặc lần thu cần học sinh và môn của nó còn tồn tại.</w:t>
+        <w:pBdr>
+          <w:left w:val="single" w:color="D97706" w:sz="18" w:space="6"/>
+        </w:pBdr>
+        <w:shd w:fill="FEF3C7" w:color="auto" w:val="clear"/>
+        <w:spacing w:after="60" w:before="60"/>
+        <w:ind w:left="360"/>
+      </w:pPr>
+      <w:r>
+        <w:rPr>
+          <w:b/>
+          <w:bCs/>
+        </w:rPr>
+        <w:t xml:space="preserve">Mẹo: </w:t>
+      </w:r>
+      <w:r>
+        <w:rPr>
+          <w:b w:val="false"/>
+          <w:bCs w:val="false"/>
+        </w:rPr>
+        <w:t xml:space="preserve">Cần hỗ trợ cài payOS? Gọi, nhắn Zalo hoặc Facebook cho admin ở mục </w:t>
+      </w:r>
+      <w:r>
+        <w:rPr>
+          <w:b/>
+          <w:bCs/>
+          <w:color w:val="0F172A"/>
+        </w:rPr>
+        <w:t xml:space="preserve">Cần hỗ trợ?</w:t>
+      </w:r>
+      <w:r>
+        <w:rPr>
+          <w:b w:val="false"/>
+          <w:bCs w:val="false"/>
+        </w:rPr>
+        <w:t xml:space="preserve"> cuối trang.</w:t>
       </w:r>
     </w:p>
     <w:p>
@@ -4791,7 +4910,7 @@
           <w:sz w:val="32"/>
           <w:szCs w:val="32"/>
         </w:rPr>
-        <w:t xml:space="preserve">12. Sao lưu Excel</w:t>
+        <w:t xml:space="preserve">11. Gói dịch vụ</w:t>
       </w:r>
     </w:p>
     <w:p>
@@ -4812,22 +4931,22 @@
           <w:b w:val="false"/>
           <w:bCs w:val="false"/>
         </w:rPr>
-        <w:t xml:space="preserve">Bấm avatar góc phải trên, chọn </w:t>
-      </w:r>
-      <w:r>
-        <w:rPr>
-          <w:b/>
-          <w:bCs/>
-          <w:color w:val="0F172A"/>
-        </w:rPr>
-        <w:t xml:space="preserve">Sao lưu dữ liệu</w:t>
-      </w:r>
-      <w:r>
-        <w:rPr>
-          <w:b w:val="false"/>
-          <w:bCs w:val="false"/>
-        </w:rPr>
-        <w:t xml:space="preserve">.</w:t>
+        <w:t xml:space="preserve">Mở </w:t>
+      </w:r>
+      <w:r>
+        <w:rPr>
+          <w:b/>
+          <w:bCs/>
+          <w:color w:val="0F172A"/>
+        </w:rPr>
+        <w:t xml:space="preserve">Gói của tôi</w:t>
+      </w:r>
+      <w:r>
+        <w:rPr>
+          <w:b w:val="false"/>
+          <w:bCs w:val="false"/>
+        </w:rPr>
+        <w:t xml:space="preserve"> để xem gói đang dùng, hạn dùng và tính năng của từng gói Standard, Plus, Pro.</w:t>
       </w:r>
     </w:p>
     <w:p>
@@ -4940,7 +5059,22 @@
           <w:b w:val="false"/>
           <w:bCs w:val="false"/>
         </w:rPr>
-        <w:t xml:space="preserve">Đọc cảnh báo: file sao lưu không mã hoá, chỉ lưu ở nơi an toàn.</w:t>
+        <w:t xml:space="preserve">Bấm mua hoặc gia hạn, chọn thời hạn và cách thanh toán rồi bấm </w:t>
+      </w:r>
+      <w:r>
+        <w:rPr>
+          <w:b/>
+          <w:bCs/>
+          <w:color w:val="0F172A"/>
+        </w:rPr>
+        <w:t xml:space="preserve">Tạo đơn</w:t>
+      </w:r>
+      <w:r>
+        <w:rPr>
+          <w:b w:val="false"/>
+          <w:bCs w:val="false"/>
+        </w:rPr>
+        <w:t xml:space="preserve">. App hiện mã QR, mã đơn và số tiền.</w:t>
       </w:r>
     </w:p>
     <w:p>
@@ -4961,22 +5095,22 @@
           <w:b w:val="false"/>
           <w:bCs w:val="false"/>
         </w:rPr>
-        <w:t xml:space="preserve">Bấm </w:t>
-      </w:r>
-      <w:r>
-        <w:rPr>
-          <w:b/>
-          <w:bCs/>
-          <w:color w:val="0F172A"/>
-        </w:rPr>
-        <w:t xml:space="preserve">Tôi hiểu, tải xuống</w:t>
-      </w:r>
-      <w:r>
-        <w:rPr>
-          <w:b w:val="false"/>
-          <w:bCs w:val="false"/>
-        </w:rPr>
-        <w:t xml:space="preserve"> để tải file Excel chứa toàn bộ dữ liệu của bạn.</w:t>
+        <w:t xml:space="preserve">Chọn </w:t>
+      </w:r>
+      <w:r>
+        <w:rPr>
+          <w:b/>
+          <w:bCs/>
+          <w:color w:val="0F172A"/>
+        </w:rPr>
+        <w:t xml:space="preserve">Kích hoạt ngay sau khi chuyển khoản</w:t>
+      </w:r>
+      <w:r>
+        <w:rPr>
+          <w:b w:val="false"/>
+          <w:bCs w:val="false"/>
+        </w:rPr>
+        <w:t xml:space="preserve">: quét QR payOS, gói bật trong vài giây khi tiền vào, không phải chờ duyệt.</w:t>
       </w:r>
     </w:p>
     <w:p>
@@ -5073,6 +5207,66 @@
     </w:p>
     <w:p>
       <w:pPr>
+        <w:spacing w:after="100"/>
+        <w:ind w:left="360"/>
+      </w:pPr>
+      <w:r>
+        <w:rPr>
+          <w:b/>
+          <w:bCs/>
+          <w:color w:val="0F766E"/>
+        </w:rPr>
+        <w:t xml:space="preserve">Bước 4. </w:t>
+      </w:r>
+      <w:r>
+        <w:rPr>
+          <w:b w:val="false"/>
+          <w:bCs w:val="false"/>
+        </w:rPr>
+        <w:t xml:space="preserve">Chọn </w:t>
+      </w:r>
+      <w:r>
+        <w:rPr>
+          <w:b/>
+          <w:bCs/>
+          <w:color w:val="0F172A"/>
+        </w:rPr>
+        <w:t xml:space="preserve">Chuyển khoản, chờ admin duyệt</w:t>
+      </w:r>
+      <w:r>
+        <w:rPr>
+          <w:b w:val="false"/>
+          <w:bCs w:val="false"/>
+        </w:rPr>
+        <w:t xml:space="preserve">: chuyển khoản đúng nội dung mã đơn, rồi báo chủ app (Gọi, Zalo, Facebook ngay trên thẻ đơn). Gói được kích hoạt sau khi quản trị viên xác nhận.</w:t>
+      </w:r>
+    </w:p>
+    <w:p>
+      <w:pPr>
+        <w:pBdr>
+          <w:left w:val="single" w:color="D97706" w:sz="18" w:space="6"/>
+        </w:pBdr>
+        <w:shd w:fill="FEF3C7" w:color="auto" w:val="clear"/>
+        <w:spacing w:after="60" w:before="60"/>
+        <w:ind w:left="360"/>
+      </w:pPr>
+      <w:r>
+        <w:rPr>
+          <w:b/>
+          <w:bCs/>
+        </w:rPr>
+        <w:t xml:space="preserve">Mẹo: </w:t>
+      </w:r>
+      <w:r>
+        <w:rPr>
+          <w:b w:val="false"/>
+          <w:bCs w:val="false"/>
+        </w:rPr>
+        <w:t xml:space="preserve">Gia hạn sớm trước khi hết hạn được tặng thêm tháng.</w:t>
+      </w:r>
+    </w:p>
+    <w:p>
+      <w:pPr>
         <w:pStyle w:val="Heading1"/>
         <w:pBdr>
           <w:bottom w:val="single" w:color="0F766E" w:sz="12" w:space="4"/>
@@ -5088,7 +5282,524 @@
           <w:sz w:val="32"/>
           <w:szCs w:val="32"/>
         </w:rPr>
-        <w:t xml:space="preserve">13. Bảo mật dữ liệu</w:t>
+        <w:t xml:space="preserve">12. Thùng rác</w:t>
+      </w:r>
+    </w:p>
+    <w:p>
+      <w:pPr>
+        <w:spacing w:after="100"/>
+        <w:ind w:left="360"/>
+      </w:pPr>
+      <w:r>
+        <w:rPr>
+          <w:b/>
+          <w:bCs/>
+          <w:color w:val="0F766E"/>
+        </w:rPr>
+        <w:t xml:space="preserve">Bước 1. </w:t>
+      </w:r>
+      <w:r>
+        <w:rPr>
+          <w:b w:val="false"/>
+          <w:bCs w:val="false"/>
+        </w:rPr>
+        <w:t xml:space="preserve">Học sinh, môn, ca dạy, lần thu đã xoá đều vào </w:t>
+      </w:r>
+      <w:r>
+        <w:rPr>
+          <w:b/>
+          <w:bCs/>
+          <w:color w:val="0F172A"/>
+        </w:rPr>
+        <w:t xml:space="preserve">Thùng rác</w:t>
+      </w:r>
+      <w:r>
+        <w:rPr>
+          <w:b w:val="false"/>
+          <w:bCs w:val="false"/>
+        </w:rPr>
+        <w:t xml:space="preserve">.</w:t>
+      </w:r>
+    </w:p>
+    <w:p>
+      <w:pPr>
+        <w:spacing w:after="100"/>
+        <w:ind w:left="360"/>
+      </w:pPr>
+      <w:r>
+        <w:rPr>
+          <w:b/>
+          <w:bCs/>
+          <w:color w:val="0F766E"/>
+        </w:rPr>
+        <w:t xml:space="preserve">Bước 2. </w:t>
+      </w:r>
+      <w:r>
+        <w:rPr>
+          <w:b w:val="false"/>
+          <w:bCs w:val="false"/>
+        </w:rPr>
+        <w:t xml:space="preserve">Mở </w:t>
+      </w:r>
+      <w:r>
+        <w:rPr>
+          <w:b/>
+          <w:bCs/>
+          <w:color w:val="0F172A"/>
+        </w:rPr>
+        <w:t xml:space="preserve">Thùng rác</w:t>
+      </w:r>
+      <w:r>
+        <w:rPr>
+          <w:b w:val="false"/>
+          <w:bCs w:val="false"/>
+        </w:rPr>
+        <w:t xml:space="preserve">, chọn loại, bấm </w:t>
+      </w:r>
+      <w:r>
+        <w:rPr>
+          <w:b/>
+          <w:bCs/>
+          <w:color w:val="0F172A"/>
+        </w:rPr>
+        <w:t xml:space="preserve">Khôi phục</w:t>
+      </w:r>
+      <w:r>
+        <w:rPr>
+          <w:b w:val="false"/>
+          <w:bCs w:val="false"/>
+        </w:rPr>
+        <w:t xml:space="preserve"> để lấy lại.</w:t>
+      </w:r>
+    </w:p>
+    <w:p>
+      <w:pPr>
+        <w:spacing w:after="80"/>
+        <w:ind w:left="360"/>
+      </w:pPr>
+      <w:r>
+        <w:drawing>
+          <wp:inline distT="0" distB="0" distL="0" distR="0">
+            <wp:extent cx="5486400" cy="3429000"/>
+            <wp:effectExtent t="0" r="0" b="0" l="0"/>
+            <wp:docPr id="51" name="" descr="" title=""/>
+            <wp:cNvGraphicFramePr>
+              <a:graphicFrameLocks xmlns:a="http://schemas.openxmlformats.org/drawingml/2006/main" noChangeAspect="1"/>
+            </wp:cNvGraphicFramePr>
+            <a:graphic xmlns:a="http://schemas.openxmlformats.org/drawingml/2006/main">
+              <a:graphicData uri="http://schemas.openxmlformats.org/drawingml/2006/picture">
+                <pic:pic xmlns:pic="http://schemas.openxmlformats.org/drawingml/2006/picture">
+                  <pic:nvPicPr>
+                    <pic:cNvPr id="0" name="" descr=""/>
+                    <pic:cNvPicPr>
+                      <a:picLocks noChangeAspect="1" noChangeArrowheads="1"/>
+                    </pic:cNvPicPr>
+                  </pic:nvPicPr>
+                  <pic:blipFill>
+                    <a:blip r:embed="rId57" cstate="none"/>
+                    <a:srcRect/>
+                    <a:stretch>
+                      <a:fillRect/>
+                    </a:stretch>
+                  </pic:blipFill>
+                  <pic:spPr bwMode="auto">
+                    <a:xfrm>
+                      <a:off x="0" y="0"/>
+                      <a:ext cx="5486400" cy="3429000"/>
+                    </a:xfrm>
+                    <a:prstGeom prst="rect">
+                      <a:avLst/>
+                    </a:prstGeom>
+                  </pic:spPr>
+                </pic:pic>
+              </a:graphicData>
+            </a:graphic>
+          </wp:inline>
+        </w:drawing>
+      </w:r>
+    </w:p>
+    <w:p>
+      <w:pPr>
+        <w:spacing w:after="160"/>
+        <w:ind w:left="360"/>
+      </w:pPr>
+      <w:r>
+        <w:drawing>
+          <wp:inline distT="0" distB="0" distL="0" distR="0">
+            <wp:extent cx="1581150" cy="3429000"/>
+            <wp:effectExtent t="0" r="0" b="0" l="0"/>
+            <wp:docPr id="52" name="" descr="" title=""/>
+            <wp:cNvGraphicFramePr>
+              <a:graphicFrameLocks xmlns:a="http://schemas.openxmlformats.org/drawingml/2006/main" noChangeAspect="1"/>
+            </wp:cNvGraphicFramePr>
+            <a:graphic xmlns:a="http://schemas.openxmlformats.org/drawingml/2006/main">
+              <a:graphicData uri="http://schemas.openxmlformats.org/drawingml/2006/picture">
+                <pic:pic xmlns:pic="http://schemas.openxmlformats.org/drawingml/2006/picture">
+                  <pic:nvPicPr>
+                    <pic:cNvPr id="0" name="" descr=""/>
+                    <pic:cNvPicPr>
+                      <a:picLocks noChangeAspect="1" noChangeArrowheads="1"/>
+                    </pic:cNvPicPr>
+                  </pic:nvPicPr>
+                  <pic:blipFill>
+                    <a:blip r:embed="rId58" cstate="none"/>
+                    <a:srcRect/>
+                    <a:stretch>
+                      <a:fillRect/>
+                    </a:stretch>
+                  </pic:blipFill>
+                  <pic:spPr bwMode="auto">
+                    <a:xfrm>
+                      <a:off x="0" y="0"/>
+                      <a:ext cx="1581150" cy="3429000"/>
+                    </a:xfrm>
+                    <a:prstGeom prst="rect">
+                      <a:avLst/>
+                    </a:prstGeom>
+                  </pic:spPr>
+                </pic:pic>
+              </a:graphicData>
+            </a:graphic>
+          </wp:inline>
+        </w:drawing>
+      </w:r>
+    </w:p>
+    <w:p>
+      <w:pPr>
+        <w:spacing w:after="100"/>
+        <w:ind w:left="360"/>
+      </w:pPr>
+      <w:r>
+        <w:rPr>
+          <w:b/>
+          <w:bCs/>
+          <w:color w:val="0F766E"/>
+        </w:rPr>
+        <w:t xml:space="preserve">Bước 3. </w:t>
+      </w:r>
+      <w:r>
+        <w:rPr>
+          <w:b w:val="false"/>
+          <w:bCs w:val="false"/>
+        </w:rPr>
+        <w:t xml:space="preserve">Khôi phục ca hoặc lần thu cần học sinh và môn của nó còn tồn tại.</w:t>
+      </w:r>
+    </w:p>
+    <w:p>
+      <w:pPr>
+        <w:pStyle w:val="Heading1"/>
+        <w:pBdr>
+          <w:bottom w:val="single" w:color="0F766E" w:sz="12" w:space="4"/>
+        </w:pBdr>
+        <w:shd w:fill="E6F4F1" w:color="auto" w:val="clear"/>
+        <w:spacing w:after="160" w:before="360"/>
+      </w:pPr>
+      <w:r>
+        <w:rPr>
+          <w:b/>
+          <w:bCs/>
+          <w:color w:val="0F766E"/>
+          <w:sz w:val="32"/>
+          <w:szCs w:val="32"/>
+        </w:rPr>
+        <w:t xml:space="preserve">13. Sao lưu Excel</w:t>
+      </w:r>
+    </w:p>
+    <w:p>
+      <w:pPr>
+        <w:spacing w:after="100"/>
+        <w:ind w:left="360"/>
+      </w:pPr>
+      <w:r>
+        <w:rPr>
+          <w:b/>
+          <w:bCs/>
+          <w:color w:val="0F766E"/>
+        </w:rPr>
+        <w:t xml:space="preserve">Bước 1. </w:t>
+      </w:r>
+      <w:r>
+        <w:rPr>
+          <w:b w:val="false"/>
+          <w:bCs w:val="false"/>
+        </w:rPr>
+        <w:t xml:space="preserve">Bấm avatar góc phải trên, chọn </w:t>
+      </w:r>
+      <w:r>
+        <w:rPr>
+          <w:b/>
+          <w:bCs/>
+          <w:color w:val="0F172A"/>
+        </w:rPr>
+        <w:t xml:space="preserve">Sao lưu dữ liệu</w:t>
+      </w:r>
+      <w:r>
+        <w:rPr>
+          <w:b w:val="false"/>
+          <w:bCs w:val="false"/>
+        </w:rPr>
+        <w:t xml:space="preserve">.</w:t>
+      </w:r>
+    </w:p>
+    <w:p>
+      <w:pPr>
+        <w:spacing w:after="80"/>
+        <w:ind w:left="360"/>
+      </w:pPr>
+      <w:r>
+        <w:drawing>
+          <wp:inline distT="0" distB="0" distL="0" distR="0">
+            <wp:extent cx="5486400" cy="3429000"/>
+            <wp:effectExtent t="0" r="0" b="0" l="0"/>
+            <wp:docPr id="53" name="" descr="" title=""/>
+            <wp:cNvGraphicFramePr>
+              <a:graphicFrameLocks xmlns:a="http://schemas.openxmlformats.org/drawingml/2006/main" noChangeAspect="1"/>
+            </wp:cNvGraphicFramePr>
+            <a:graphic xmlns:a="http://schemas.openxmlformats.org/drawingml/2006/main">
+              <a:graphicData uri="http://schemas.openxmlformats.org/drawingml/2006/picture">
+                <pic:pic xmlns:pic="http://schemas.openxmlformats.org/drawingml/2006/picture">
+                  <pic:nvPicPr>
+                    <pic:cNvPr id="0" name="" descr=""/>
+                    <pic:cNvPicPr>
+                      <a:picLocks noChangeAspect="1" noChangeArrowheads="1"/>
+                    </pic:cNvPicPr>
+                  </pic:nvPicPr>
+                  <pic:blipFill>
+                    <a:blip r:embed="rId59" cstate="none"/>
+                    <a:srcRect/>
+                    <a:stretch>
+                      <a:fillRect/>
+                    </a:stretch>
+                  </pic:blipFill>
+                  <pic:spPr bwMode="auto">
+                    <a:xfrm>
+                      <a:off x="0" y="0"/>
+                      <a:ext cx="5486400" cy="3429000"/>
+                    </a:xfrm>
+                    <a:prstGeom prst="rect">
+                      <a:avLst/>
+                    </a:prstGeom>
+                  </pic:spPr>
+                </pic:pic>
+              </a:graphicData>
+            </a:graphic>
+          </wp:inline>
+        </w:drawing>
+      </w:r>
+    </w:p>
+    <w:p>
+      <w:pPr>
+        <w:spacing w:after="160"/>
+        <w:ind w:left="360"/>
+      </w:pPr>
+      <w:r>
+        <w:drawing>
+          <wp:inline distT="0" distB="0" distL="0" distR="0">
+            <wp:extent cx="1581150" cy="3429000"/>
+            <wp:effectExtent t="0" r="0" b="0" l="0"/>
+            <wp:docPr id="54" name="" descr="" title=""/>
+            <wp:cNvGraphicFramePr>
+              <a:graphicFrameLocks xmlns:a="http://schemas.openxmlformats.org/drawingml/2006/main" noChangeAspect="1"/>
+            </wp:cNvGraphicFramePr>
+            <a:graphic xmlns:a="http://schemas.openxmlformats.org/drawingml/2006/main">
+              <a:graphicData uri="http://schemas.openxmlformats.org/drawingml/2006/picture">
+                <pic:pic xmlns:pic="http://schemas.openxmlformats.org/drawingml/2006/picture">
+                  <pic:nvPicPr>
+                    <pic:cNvPr id="0" name="" descr=""/>
+                    <pic:cNvPicPr>
+                      <a:picLocks noChangeAspect="1" noChangeArrowheads="1"/>
+                    </pic:cNvPicPr>
+                  </pic:nvPicPr>
+                  <pic:blipFill>
+                    <a:blip r:embed="rId60" cstate="none"/>
+                    <a:srcRect/>
+                    <a:stretch>
+                      <a:fillRect/>
+                    </a:stretch>
+                  </pic:blipFill>
+                  <pic:spPr bwMode="auto">
+                    <a:xfrm>
+                      <a:off x="0" y="0"/>
+                      <a:ext cx="1581150" cy="3429000"/>
+                    </a:xfrm>
+                    <a:prstGeom prst="rect">
+                      <a:avLst/>
+                    </a:prstGeom>
+                  </pic:spPr>
+                </pic:pic>
+              </a:graphicData>
+            </a:graphic>
+          </wp:inline>
+        </w:drawing>
+      </w:r>
+    </w:p>
+    <w:p>
+      <w:pPr>
+        <w:spacing w:after="100"/>
+        <w:ind w:left="360"/>
+      </w:pPr>
+      <w:r>
+        <w:rPr>
+          <w:b/>
+          <w:bCs/>
+          <w:color w:val="0F766E"/>
+        </w:rPr>
+        <w:t xml:space="preserve">Bước 2. </w:t>
+      </w:r>
+      <w:r>
+        <w:rPr>
+          <w:b w:val="false"/>
+          <w:bCs w:val="false"/>
+        </w:rPr>
+        <w:t xml:space="preserve">Đọc cảnh báo: file sao lưu không mã hoá, chỉ lưu ở nơi an toàn.</w:t>
+      </w:r>
+    </w:p>
+    <w:p>
+      <w:pPr>
+        <w:spacing w:after="100"/>
+        <w:ind w:left="360"/>
+      </w:pPr>
+      <w:r>
+        <w:rPr>
+          <w:b/>
+          <w:bCs/>
+          <w:color w:val="0F766E"/>
+        </w:rPr>
+        <w:t xml:space="preserve">Bước 3. </w:t>
+      </w:r>
+      <w:r>
+        <w:rPr>
+          <w:b w:val="false"/>
+          <w:bCs w:val="false"/>
+        </w:rPr>
+        <w:t xml:space="preserve">Bấm </w:t>
+      </w:r>
+      <w:r>
+        <w:rPr>
+          <w:b/>
+          <w:bCs/>
+          <w:color w:val="0F172A"/>
+        </w:rPr>
+        <w:t xml:space="preserve">Tôi hiểu, tải xuống</w:t>
+      </w:r>
+      <w:r>
+        <w:rPr>
+          <w:b w:val="false"/>
+          <w:bCs w:val="false"/>
+        </w:rPr>
+        <w:t xml:space="preserve"> để tải file Excel chứa toàn bộ dữ liệu của bạn.</w:t>
+      </w:r>
+    </w:p>
+    <w:p>
+      <w:pPr>
+        <w:spacing w:after="80"/>
+        <w:ind w:left="360"/>
+      </w:pPr>
+      <w:r>
+        <w:drawing>
+          <wp:inline distT="0" distB="0" distL="0" distR="0">
+            <wp:extent cx="5486400" cy="3429000"/>
+            <wp:effectExtent t="0" r="0" b="0" l="0"/>
+            <wp:docPr id="55" name="" descr="" title=""/>
+            <wp:cNvGraphicFramePr>
+              <a:graphicFrameLocks xmlns:a="http://schemas.openxmlformats.org/drawingml/2006/main" noChangeAspect="1"/>
+            </wp:cNvGraphicFramePr>
+            <a:graphic xmlns:a="http://schemas.openxmlformats.org/drawingml/2006/main">
+              <a:graphicData uri="http://schemas.openxmlformats.org/drawingml/2006/picture">
+                <pic:pic xmlns:pic="http://schemas.openxmlformats.org/drawingml/2006/picture">
+                  <pic:nvPicPr>
+                    <pic:cNvPr id="0" name="" descr=""/>
+                    <pic:cNvPicPr>
+                      <a:picLocks noChangeAspect="1" noChangeArrowheads="1"/>
+                    </pic:cNvPicPr>
+                  </pic:nvPicPr>
+                  <pic:blipFill>
+                    <a:blip r:embed="rId61" cstate="none"/>
+                    <a:srcRect/>
+                    <a:stretch>
+                      <a:fillRect/>
+                    </a:stretch>
+                  </pic:blipFill>
+                  <pic:spPr bwMode="auto">
+                    <a:xfrm>
+                      <a:off x="0" y="0"/>
+                      <a:ext cx="5486400" cy="3429000"/>
+                    </a:xfrm>
+                    <a:prstGeom prst="rect">
+                      <a:avLst/>
+                    </a:prstGeom>
+                  </pic:spPr>
+                </pic:pic>
+              </a:graphicData>
+            </a:graphic>
+          </wp:inline>
+        </w:drawing>
+      </w:r>
+    </w:p>
+    <w:p>
+      <w:pPr>
+        <w:spacing w:after="160"/>
+        <w:ind w:left="360"/>
+      </w:pPr>
+      <w:r>
+        <w:drawing>
+          <wp:inline distT="0" distB="0" distL="0" distR="0">
+            <wp:extent cx="1581150" cy="3429000"/>
+            <wp:effectExtent t="0" r="0" b="0" l="0"/>
+            <wp:docPr id="56" name="" descr="" title=""/>
+            <wp:cNvGraphicFramePr>
+              <a:graphicFrameLocks xmlns:a="http://schemas.openxmlformats.org/drawingml/2006/main" noChangeAspect="1"/>
+            </wp:cNvGraphicFramePr>
+            <a:graphic xmlns:a="http://schemas.openxmlformats.org/drawingml/2006/main">
+              <a:graphicData uri="http://schemas.openxmlformats.org/drawingml/2006/picture">
+                <pic:pic xmlns:pic="http://schemas.openxmlformats.org/drawingml/2006/picture">
+                  <pic:nvPicPr>
+                    <pic:cNvPr id="0" name="" descr=""/>
+                    <pic:cNvPicPr>
+                      <a:picLocks noChangeAspect="1" noChangeArrowheads="1"/>
+                    </pic:cNvPicPr>
+                  </pic:nvPicPr>
+                  <pic:blipFill>
+                    <a:blip r:embed="rId62" cstate="none"/>
+                    <a:srcRect/>
+                    <a:stretch>
+                      <a:fillRect/>
+                    </a:stretch>
+                  </pic:blipFill>
+                  <pic:spPr bwMode="auto">
+                    <a:xfrm>
+                      <a:off x="0" y="0"/>
+                      <a:ext cx="1581150" cy="3429000"/>
+                    </a:xfrm>
+                    <a:prstGeom prst="rect">
+                      <a:avLst/>
+                    </a:prstGeom>
+                  </pic:spPr>
+                </pic:pic>
+              </a:graphicData>
+            </a:graphic>
+          </wp:inline>
+        </w:drawing>
+      </w:r>
+    </w:p>
+    <w:p>
+      <w:pPr>
+        <w:pStyle w:val="Heading1"/>
+        <w:pBdr>
+          <w:bottom w:val="single" w:color="0F766E" w:sz="12" w:space="4"/>
+        </w:pBdr>
+        <w:shd w:fill="E6F4F1" w:color="auto" w:val="clear"/>
+        <w:spacing w:after="160" w:before="360"/>
+      </w:pPr>
+      <w:r>
+        <w:rPr>
+          <w:b/>
+          <w:bCs/>
+          <w:color w:val="0F766E"/>
+          <w:sz w:val="32"/>
+          <w:szCs w:val="32"/>
+        </w:rPr>
+        <w:t xml:space="preserve">14. Bảo mật dữ liệu</w:t>
       </w:r>
     </w:p>
     <w:p>

</xml_diff>

<commit_message>
docs(ai): hướng dẫn chuông tiền payOS + ảnh
</commit_message>
<xml_diff>
--- a/public/guide/huong-dan-su-dung.docx
+++ b/public/guide/huong-dan-su-dung.docx
@@ -4856,65 +4856,6 @@
     </w:p>
     <w:p>
       <w:pPr>
-        <w:pBdr>
-          <w:left w:val="single" w:color="D97706" w:sz="18" w:space="6"/>
-        </w:pBdr>
-        <w:shd w:fill="FEF3C7" w:color="auto" w:val="clear"/>
-        <w:spacing w:after="60" w:before="60"/>
-        <w:ind w:left="360"/>
-      </w:pPr>
-      <w:r>
-        <w:rPr>
-          <w:b/>
-          <w:bCs/>
-        </w:rPr>
-        <w:t xml:space="preserve">Mẹo: </w:t>
-      </w:r>
-      <w:r>
-        <w:rPr>
-          <w:b w:val="false"/>
-          <w:bCs w:val="false"/>
-        </w:rPr>
-        <w:t xml:space="preserve">Cần hỗ trợ cài payOS? Gọi, nhắn Zalo hoặc Facebook cho admin ở mục </w:t>
-      </w:r>
-      <w:r>
-        <w:rPr>
-          <w:b/>
-          <w:bCs/>
-          <w:color w:val="0F172A"/>
-        </w:rPr>
-        <w:t xml:space="preserve">Cần hỗ trợ?</w:t>
-      </w:r>
-      <w:r>
-        <w:rPr>
-          <w:b w:val="false"/>
-          <w:bCs w:val="false"/>
-        </w:rPr>
-        <w:t xml:space="preserve"> cuối trang.</w:t>
-      </w:r>
-    </w:p>
-    <w:p>
-      <w:pPr>
-        <w:pStyle w:val="Heading1"/>
-        <w:pBdr>
-          <w:bottom w:val="single" w:color="0F766E" w:sz="12" w:space="4"/>
-        </w:pBdr>
-        <w:shd w:fill="E6F4F1" w:color="auto" w:val="clear"/>
-        <w:spacing w:after="160" w:before="360"/>
-      </w:pPr>
-      <w:r>
-        <w:rPr>
-          <w:b/>
-          <w:bCs/>
-          <w:color w:val="0F766E"/>
-          <w:sz w:val="32"/>
-          <w:szCs w:val="32"/>
-        </w:rPr>
-        <w:t xml:space="preserve">11. Gói dịch vụ</w:t>
-      </w:r>
-    </w:p>
-    <w:p>
-      <w:pPr>
         <w:spacing w:after="100"/>
         <w:ind w:left="360"/>
       </w:pPr>
@@ -4924,29 +4865,14 @@
           <w:bCs/>
           <w:color w:val="0F766E"/>
         </w:rPr>
-        <w:t xml:space="preserve">Bước 1. </w:t>
-      </w:r>
-      <w:r>
-        <w:rPr>
-          <w:b w:val="false"/>
-          <w:bCs w:val="false"/>
-        </w:rPr>
-        <w:t xml:space="preserve">Mở </w:t>
-      </w:r>
-      <w:r>
-        <w:rPr>
-          <w:b/>
-          <w:bCs/>
-          <w:color w:val="0F172A"/>
-        </w:rPr>
-        <w:t xml:space="preserve">Gói của tôi</w:t>
-      </w:r>
-      <w:r>
-        <w:rPr>
-          <w:b w:val="false"/>
-          <w:bCs w:val="false"/>
-        </w:rPr>
-        <w:t xml:space="preserve"> để xem gói đang dùng, hạn dùng và tính năng của từng gói Standard, Plus, Pro.</w:t>
+        <w:t xml:space="preserve">Bước 9. </w:t>
+      </w:r>
+      <w:r>
+        <w:rPr>
+          <w:b w:val="false"/>
+          <w:bCs w:val="false"/>
+        </w:rPr>
+        <w:t xml:space="preserve">Chuông 🔔 trên cùng báo ngay khoản vừa vào và của học sinh nào, không cần tải lại trang; bấm một dòng để mở học sinh đó.</w:t>
       </w:r>
     </w:p>
     <w:p>
@@ -5043,6 +4969,65 @@
     </w:p>
     <w:p>
       <w:pPr>
+        <w:pBdr>
+          <w:left w:val="single" w:color="D97706" w:sz="18" w:space="6"/>
+        </w:pBdr>
+        <w:shd w:fill="FEF3C7" w:color="auto" w:val="clear"/>
+        <w:spacing w:after="60" w:before="60"/>
+        <w:ind w:left="360"/>
+      </w:pPr>
+      <w:r>
+        <w:rPr>
+          <w:b/>
+          <w:bCs/>
+        </w:rPr>
+        <w:t xml:space="preserve">Mẹo: </w:t>
+      </w:r>
+      <w:r>
+        <w:rPr>
+          <w:b w:val="false"/>
+          <w:bCs w:val="false"/>
+        </w:rPr>
+        <w:t xml:space="preserve">Cần hỗ trợ cài payOS? Gọi, nhắn Zalo hoặc Facebook cho admin ở mục </w:t>
+      </w:r>
+      <w:r>
+        <w:rPr>
+          <w:b/>
+          <w:bCs/>
+          <w:color w:val="0F172A"/>
+        </w:rPr>
+        <w:t xml:space="preserve">Cần hỗ trợ?</w:t>
+      </w:r>
+      <w:r>
+        <w:rPr>
+          <w:b w:val="false"/>
+          <w:bCs w:val="false"/>
+        </w:rPr>
+        <w:t xml:space="preserve"> cuối trang.</w:t>
+      </w:r>
+    </w:p>
+    <w:p>
+      <w:pPr>
+        <w:pStyle w:val="Heading1"/>
+        <w:pBdr>
+          <w:bottom w:val="single" w:color="0F766E" w:sz="12" w:space="4"/>
+        </w:pBdr>
+        <w:shd w:fill="E6F4F1" w:color="auto" w:val="clear"/>
+        <w:spacing w:after="160" w:before="360"/>
+      </w:pPr>
+      <w:r>
+        <w:rPr>
+          <w:b/>
+          <w:bCs/>
+          <w:color w:val="0F766E"/>
+          <w:sz w:val="32"/>
+          <w:szCs w:val="32"/>
+        </w:rPr>
+        <w:t xml:space="preserve">11. Gói dịch vụ</w:t>
+      </w:r>
+    </w:p>
+    <w:p>
+      <w:pPr>
         <w:spacing w:after="100"/>
         <w:ind w:left="360"/>
       </w:pPr>
@@ -5052,65 +5037,29 @@
           <w:bCs/>
           <w:color w:val="0F766E"/>
         </w:rPr>
-        <w:t xml:space="preserve">Bước 2. </w:t>
-      </w:r>
-      <w:r>
-        <w:rPr>
-          <w:b w:val="false"/>
-          <w:bCs w:val="false"/>
-        </w:rPr>
-        <w:t xml:space="preserve">Bấm mua hoặc gia hạn, chọn thời hạn và cách thanh toán rồi bấm </w:t>
-      </w:r>
-      <w:r>
-        <w:rPr>
-          <w:b/>
-          <w:bCs/>
-          <w:color w:val="0F172A"/>
-        </w:rPr>
-        <w:t xml:space="preserve">Tạo đơn</w:t>
-      </w:r>
-      <w:r>
-        <w:rPr>
-          <w:b w:val="false"/>
-          <w:bCs w:val="false"/>
-        </w:rPr>
-        <w:t xml:space="preserve">. App hiện mã QR, mã đơn và số tiền.</w:t>
-      </w:r>
-    </w:p>
-    <w:p>
-      <w:pPr>
-        <w:spacing w:after="100"/>
-        <w:ind w:left="360"/>
-      </w:pPr>
-      <w:r>
-        <w:rPr>
-          <w:b/>
-          <w:bCs/>
-          <w:color w:val="0F766E"/>
-        </w:rPr>
-        <w:t xml:space="preserve">Bước 3. </w:t>
-      </w:r>
-      <w:r>
-        <w:rPr>
-          <w:b w:val="false"/>
-          <w:bCs w:val="false"/>
-        </w:rPr>
-        <w:t xml:space="preserve">Chọn </w:t>
-      </w:r>
-      <w:r>
-        <w:rPr>
-          <w:b/>
-          <w:bCs/>
-          <w:color w:val="0F172A"/>
-        </w:rPr>
-        <w:t xml:space="preserve">Kích hoạt ngay sau khi chuyển khoản</w:t>
-      </w:r>
-      <w:r>
-        <w:rPr>
-          <w:b w:val="false"/>
-          <w:bCs w:val="false"/>
-        </w:rPr>
-        <w:t xml:space="preserve">: quét QR payOS, gói bật trong vài giây khi tiền vào, không phải chờ duyệt.</w:t>
+        <w:t xml:space="preserve">Bước 1. </w:t>
+      </w:r>
+      <w:r>
+        <w:rPr>
+          <w:b w:val="false"/>
+          <w:bCs w:val="false"/>
+        </w:rPr>
+        <w:t xml:space="preserve">Mở </w:t>
+      </w:r>
+      <w:r>
+        <w:rPr>
+          <w:b/>
+          <w:bCs/>
+          <w:color w:val="0F172A"/>
+        </w:rPr>
+        <w:t xml:space="preserve">Gói của tôi</w:t>
+      </w:r>
+      <w:r>
+        <w:rPr>
+          <w:b w:val="false"/>
+          <w:bCs w:val="false"/>
+        </w:rPr>
+        <w:t xml:space="preserve"> để xem gói đang dùng, hạn dùng và tính năng của từng gói Standard, Plus, Pro.</w:t>
       </w:r>
     </w:p>
     <w:p>
@@ -5216,7 +5165,43 @@
           <w:bCs/>
           <w:color w:val="0F766E"/>
         </w:rPr>
-        <w:t xml:space="preserve">Bước 4. </w:t>
+        <w:t xml:space="preserve">Bước 2. </w:t>
+      </w:r>
+      <w:r>
+        <w:rPr>
+          <w:b w:val="false"/>
+          <w:bCs w:val="false"/>
+        </w:rPr>
+        <w:t xml:space="preserve">Bấm mua hoặc gia hạn, chọn thời hạn và cách thanh toán rồi bấm </w:t>
+      </w:r>
+      <w:r>
+        <w:rPr>
+          <w:b/>
+          <w:bCs/>
+          <w:color w:val="0F172A"/>
+        </w:rPr>
+        <w:t xml:space="preserve">Tạo đơn</w:t>
+      </w:r>
+      <w:r>
+        <w:rPr>
+          <w:b w:val="false"/>
+          <w:bCs w:val="false"/>
+        </w:rPr>
+        <w:t xml:space="preserve">. App hiện mã QR, mã đơn và số tiền.</w:t>
+      </w:r>
+    </w:p>
+    <w:p>
+      <w:pPr>
+        <w:spacing w:after="100"/>
+        <w:ind w:left="360"/>
+      </w:pPr>
+      <w:r>
+        <w:rPr>
+          <w:b/>
+          <w:bCs/>
+          <w:color w:val="0F766E"/>
+        </w:rPr>
+        <w:t xml:space="preserve">Bước 3. </w:t>
       </w:r>
       <w:r>
         <w:rPr>
@@ -5231,145 +5216,14 @@
           <w:bCs/>
           <w:color w:val="0F172A"/>
         </w:rPr>
-        <w:t xml:space="preserve">Chuyển khoản, chờ admin duyệt</w:t>
-      </w:r>
-      <w:r>
-        <w:rPr>
-          <w:b w:val="false"/>
-          <w:bCs w:val="false"/>
-        </w:rPr>
-        <w:t xml:space="preserve">: chuyển khoản đúng nội dung mã đơn, rồi báo chủ app (Gọi, Zalo, Facebook ngay trên thẻ đơn). Gói được kích hoạt sau khi quản trị viên xác nhận.</w:t>
-      </w:r>
-    </w:p>
-    <w:p>
-      <w:pPr>
-        <w:pBdr>
-          <w:left w:val="single" w:color="D97706" w:sz="18" w:space="6"/>
-        </w:pBdr>
-        <w:shd w:fill="FEF3C7" w:color="auto" w:val="clear"/>
-        <w:spacing w:after="60" w:before="60"/>
-        <w:ind w:left="360"/>
-      </w:pPr>
-      <w:r>
-        <w:rPr>
-          <w:b/>
-          <w:bCs/>
-        </w:rPr>
-        <w:t xml:space="preserve">Mẹo: </w:t>
-      </w:r>
-      <w:r>
-        <w:rPr>
-          <w:b w:val="false"/>
-          <w:bCs w:val="false"/>
-        </w:rPr>
-        <w:t xml:space="preserve">Gia hạn sớm trước khi hết hạn được tặng thêm tháng.</w:t>
-      </w:r>
-    </w:p>
-    <w:p>
-      <w:pPr>
-        <w:pStyle w:val="Heading1"/>
-        <w:pBdr>
-          <w:bottom w:val="single" w:color="0F766E" w:sz="12" w:space="4"/>
-        </w:pBdr>
-        <w:shd w:fill="E6F4F1" w:color="auto" w:val="clear"/>
-        <w:spacing w:after="160" w:before="360"/>
-      </w:pPr>
-      <w:r>
-        <w:rPr>
-          <w:b/>
-          <w:bCs/>
-          <w:color w:val="0F766E"/>
-          <w:sz w:val="32"/>
-          <w:szCs w:val="32"/>
-        </w:rPr>
-        <w:t xml:space="preserve">12. Thùng rác</w:t>
-      </w:r>
-    </w:p>
-    <w:p>
-      <w:pPr>
-        <w:spacing w:after="100"/>
-        <w:ind w:left="360"/>
-      </w:pPr>
-      <w:r>
-        <w:rPr>
-          <w:b/>
-          <w:bCs/>
-          <w:color w:val="0F766E"/>
-        </w:rPr>
-        <w:t xml:space="preserve">Bước 1. </w:t>
-      </w:r>
-      <w:r>
-        <w:rPr>
-          <w:b w:val="false"/>
-          <w:bCs w:val="false"/>
-        </w:rPr>
-        <w:t xml:space="preserve">Học sinh, môn, ca dạy, lần thu đã xoá đều vào </w:t>
-      </w:r>
-      <w:r>
-        <w:rPr>
-          <w:b/>
-          <w:bCs/>
-          <w:color w:val="0F172A"/>
-        </w:rPr>
-        <w:t xml:space="preserve">Thùng rác</w:t>
-      </w:r>
-      <w:r>
-        <w:rPr>
-          <w:b w:val="false"/>
-          <w:bCs w:val="false"/>
-        </w:rPr>
-        <w:t xml:space="preserve">.</w:t>
-      </w:r>
-    </w:p>
-    <w:p>
-      <w:pPr>
-        <w:spacing w:after="100"/>
-        <w:ind w:left="360"/>
-      </w:pPr>
-      <w:r>
-        <w:rPr>
-          <w:b/>
-          <w:bCs/>
-          <w:color w:val="0F766E"/>
-        </w:rPr>
-        <w:t xml:space="preserve">Bước 2. </w:t>
-      </w:r>
-      <w:r>
-        <w:rPr>
-          <w:b w:val="false"/>
-          <w:bCs w:val="false"/>
-        </w:rPr>
-        <w:t xml:space="preserve">Mở </w:t>
-      </w:r>
-      <w:r>
-        <w:rPr>
-          <w:b/>
-          <w:bCs/>
-          <w:color w:val="0F172A"/>
-        </w:rPr>
-        <w:t xml:space="preserve">Thùng rác</w:t>
-      </w:r>
-      <w:r>
-        <w:rPr>
-          <w:b w:val="false"/>
-          <w:bCs w:val="false"/>
-        </w:rPr>
-        <w:t xml:space="preserve">, chọn loại, bấm </w:t>
-      </w:r>
-      <w:r>
-        <w:rPr>
-          <w:b/>
-          <w:bCs/>
-          <w:color w:val="0F172A"/>
-        </w:rPr>
-        <w:t xml:space="preserve">Khôi phục</w:t>
-      </w:r>
-      <w:r>
-        <w:rPr>
-          <w:b w:val="false"/>
-          <w:bCs w:val="false"/>
-        </w:rPr>
-        <w:t xml:space="preserve"> để lấy lại.</w:t>
+        <w:t xml:space="preserve">Kích hoạt ngay sau khi chuyển khoản</w:t>
+      </w:r>
+      <w:r>
+        <w:rPr>
+          <w:b w:val="false"/>
+          <w:bCs w:val="false"/>
+        </w:rPr>
+        <w:t xml:space="preserve">: quét QR payOS, gói bật trong vài giây khi tiền vào, không phải chờ duyệt.</w:t>
       </w:r>
     </w:p>
     <w:p>
@@ -5475,14 +5329,53 @@
           <w:bCs/>
           <w:color w:val="0F766E"/>
         </w:rPr>
-        <w:t xml:space="preserve">Bước 3. </w:t>
-      </w:r>
-      <w:r>
-        <w:rPr>
-          <w:b w:val="false"/>
-          <w:bCs w:val="false"/>
-        </w:rPr>
-        <w:t xml:space="preserve">Khôi phục ca hoặc lần thu cần học sinh và môn của nó còn tồn tại.</w:t>
+        <w:t xml:space="preserve">Bước 4. </w:t>
+      </w:r>
+      <w:r>
+        <w:rPr>
+          <w:b w:val="false"/>
+          <w:bCs w:val="false"/>
+        </w:rPr>
+        <w:t xml:space="preserve">Chọn </w:t>
+      </w:r>
+      <w:r>
+        <w:rPr>
+          <w:b/>
+          <w:bCs/>
+          <w:color w:val="0F172A"/>
+        </w:rPr>
+        <w:t xml:space="preserve">Chuyển khoản, chờ admin duyệt</w:t>
+      </w:r>
+      <w:r>
+        <w:rPr>
+          <w:b w:val="false"/>
+          <w:bCs w:val="false"/>
+        </w:rPr>
+        <w:t xml:space="preserve">: chuyển khoản đúng nội dung mã đơn, rồi báo chủ app (Gọi, Zalo, Facebook ngay trên thẻ đơn). Gói được kích hoạt sau khi quản trị viên xác nhận.</w:t>
+      </w:r>
+    </w:p>
+    <w:p>
+      <w:pPr>
+        <w:pBdr>
+          <w:left w:val="single" w:color="D97706" w:sz="18" w:space="6"/>
+        </w:pBdr>
+        <w:shd w:fill="FEF3C7" w:color="auto" w:val="clear"/>
+        <w:spacing w:after="60" w:before="60"/>
+        <w:ind w:left="360"/>
+      </w:pPr>
+      <w:r>
+        <w:rPr>
+          <w:b/>
+          <w:bCs/>
+        </w:rPr>
+        <w:t xml:space="preserve">Mẹo: </w:t>
+      </w:r>
+      <w:r>
+        <w:rPr>
+          <w:b w:val="false"/>
+          <w:bCs w:val="false"/>
+        </w:rPr>
+        <w:t xml:space="preserve">Gia hạn sớm trước khi hết hạn được tặng thêm tháng.</w:t>
       </w:r>
     </w:p>
     <w:p>
@@ -5502,7 +5395,7 @@
           <w:sz w:val="32"/>
           <w:szCs w:val="32"/>
         </w:rPr>
-        <w:t xml:space="preserve">13. Sao lưu Excel</w:t>
+        <w:t xml:space="preserve">12. Thùng rác</w:t>
       </w:r>
     </w:p>
     <w:p>
@@ -5523,15 +5416,15 @@
           <w:b w:val="false"/>
           <w:bCs w:val="false"/>
         </w:rPr>
-        <w:t xml:space="preserve">Bấm avatar góc phải trên, chọn </w:t>
-      </w:r>
-      <w:r>
-        <w:rPr>
-          <w:b/>
-          <w:bCs/>
-          <w:color w:val="0F172A"/>
-        </w:rPr>
-        <w:t xml:space="preserve">Sao lưu dữ liệu</w:t>
+        <w:t xml:space="preserve">Học sinh, môn, ca dạy, lần thu đã xoá đều vào </w:t>
+      </w:r>
+      <w:r>
+        <w:rPr>
+          <w:b/>
+          <w:bCs/>
+          <w:color w:val="0F172A"/>
+        </w:rPr>
+        <w:t xml:space="preserve">Thùng rác</w:t>
       </w:r>
       <w:r>
         <w:rPr>
@@ -5539,6 +5432,57 @@
           <w:bCs w:val="false"/>
         </w:rPr>
         <w:t xml:space="preserve">.</w:t>
+      </w:r>
+    </w:p>
+    <w:p>
+      <w:pPr>
+        <w:spacing w:after="100"/>
+        <w:ind w:left="360"/>
+      </w:pPr>
+      <w:r>
+        <w:rPr>
+          <w:b/>
+          <w:bCs/>
+          <w:color w:val="0F766E"/>
+        </w:rPr>
+        <w:t xml:space="preserve">Bước 2. </w:t>
+      </w:r>
+      <w:r>
+        <w:rPr>
+          <w:b w:val="false"/>
+          <w:bCs w:val="false"/>
+        </w:rPr>
+        <w:t xml:space="preserve">Mở </w:t>
+      </w:r>
+      <w:r>
+        <w:rPr>
+          <w:b/>
+          <w:bCs/>
+          <w:color w:val="0F172A"/>
+        </w:rPr>
+        <w:t xml:space="preserve">Thùng rác</w:t>
+      </w:r>
+      <w:r>
+        <w:rPr>
+          <w:b w:val="false"/>
+          <w:bCs w:val="false"/>
+        </w:rPr>
+        <w:t xml:space="preserve">, chọn loại, bấm </w:t>
+      </w:r>
+      <w:r>
+        <w:rPr>
+          <w:b/>
+          <w:bCs/>
+          <w:color w:val="0F172A"/>
+        </w:rPr>
+        <w:t xml:space="preserve">Khôi phục</w:t>
+      </w:r>
+      <w:r>
+        <w:rPr>
+          <w:b w:val="false"/>
+          <w:bCs w:val="false"/>
+        </w:rPr>
+        <w:t xml:space="preserve"> để lấy lại.</w:t>
       </w:r>
     </w:p>
     <w:p>
@@ -5644,14 +5588,34 @@
           <w:bCs/>
           <w:color w:val="0F766E"/>
         </w:rPr>
-        <w:t xml:space="preserve">Bước 2. </w:t>
-      </w:r>
-      <w:r>
-        <w:rPr>
-          <w:b w:val="false"/>
-          <w:bCs w:val="false"/>
-        </w:rPr>
-        <w:t xml:space="preserve">Đọc cảnh báo: file sao lưu không mã hoá, chỉ lưu ở nơi an toàn.</w:t>
+        <w:t xml:space="preserve">Bước 3. </w:t>
+      </w:r>
+      <w:r>
+        <w:rPr>
+          <w:b w:val="false"/>
+          <w:bCs w:val="false"/>
+        </w:rPr>
+        <w:t xml:space="preserve">Khôi phục ca hoặc lần thu cần học sinh và môn của nó còn tồn tại.</w:t>
+      </w:r>
+    </w:p>
+    <w:p>
+      <w:pPr>
+        <w:pStyle w:val="Heading1"/>
+        <w:pBdr>
+          <w:bottom w:val="single" w:color="0F766E" w:sz="12" w:space="4"/>
+        </w:pBdr>
+        <w:shd w:fill="E6F4F1" w:color="auto" w:val="clear"/>
+        <w:spacing w:after="160" w:before="360"/>
+      </w:pPr>
+      <w:r>
+        <w:rPr>
+          <w:b/>
+          <w:bCs/>
+          <w:color w:val="0F766E"/>
+          <w:sz w:val="32"/>
+          <w:szCs w:val="32"/>
+        </w:rPr>
+        <w:t xml:space="preserve">13. Sao lưu Excel</w:t>
       </w:r>
     </w:p>
     <w:p>
@@ -5665,29 +5629,29 @@
           <w:bCs/>
           <w:color w:val="0F766E"/>
         </w:rPr>
-        <w:t xml:space="preserve">Bước 3. </w:t>
-      </w:r>
-      <w:r>
-        <w:rPr>
-          <w:b w:val="false"/>
-          <w:bCs w:val="false"/>
-        </w:rPr>
-        <w:t xml:space="preserve">Bấm </w:t>
-      </w:r>
-      <w:r>
-        <w:rPr>
-          <w:b/>
-          <w:bCs/>
-          <w:color w:val="0F172A"/>
-        </w:rPr>
-        <w:t xml:space="preserve">Tôi hiểu, tải xuống</w:t>
-      </w:r>
-      <w:r>
-        <w:rPr>
-          <w:b w:val="false"/>
-          <w:bCs w:val="false"/>
-        </w:rPr>
-        <w:t xml:space="preserve"> để tải file Excel chứa toàn bộ dữ liệu của bạn.</w:t>
+        <w:t xml:space="preserve">Bước 1. </w:t>
+      </w:r>
+      <w:r>
+        <w:rPr>
+          <w:b w:val="false"/>
+          <w:bCs w:val="false"/>
+        </w:rPr>
+        <w:t xml:space="preserve">Bấm avatar góc phải trên, chọn </w:t>
+      </w:r>
+      <w:r>
+        <w:rPr>
+          <w:b/>
+          <w:bCs/>
+          <w:color w:val="0F172A"/>
+        </w:rPr>
+        <w:t xml:space="preserve">Sao lưu dữ liệu</w:t>
+      </w:r>
+      <w:r>
+        <w:rPr>
+          <w:b w:val="false"/>
+          <w:bCs w:val="false"/>
+        </w:rPr>
+        <w:t xml:space="preserve">.</w:t>
       </w:r>
     </w:p>
     <w:p>
@@ -5761,6 +5725,155 @@
                   </pic:nvPicPr>
                   <pic:blipFill>
                     <a:blip r:embed="rId62" cstate="none"/>
+                    <a:srcRect/>
+                    <a:stretch>
+                      <a:fillRect/>
+                    </a:stretch>
+                  </pic:blipFill>
+                  <pic:spPr bwMode="auto">
+                    <a:xfrm>
+                      <a:off x="0" y="0"/>
+                      <a:ext cx="1581150" cy="3429000"/>
+                    </a:xfrm>
+                    <a:prstGeom prst="rect">
+                      <a:avLst/>
+                    </a:prstGeom>
+                  </pic:spPr>
+                </pic:pic>
+              </a:graphicData>
+            </a:graphic>
+          </wp:inline>
+        </w:drawing>
+      </w:r>
+    </w:p>
+    <w:p>
+      <w:pPr>
+        <w:spacing w:after="100"/>
+        <w:ind w:left="360"/>
+      </w:pPr>
+      <w:r>
+        <w:rPr>
+          <w:b/>
+          <w:bCs/>
+          <w:color w:val="0F766E"/>
+        </w:rPr>
+        <w:t xml:space="preserve">Bước 2. </w:t>
+      </w:r>
+      <w:r>
+        <w:rPr>
+          <w:b w:val="false"/>
+          <w:bCs w:val="false"/>
+        </w:rPr>
+        <w:t xml:space="preserve">Đọc cảnh báo: file sao lưu không mã hoá, chỉ lưu ở nơi an toàn.</w:t>
+      </w:r>
+    </w:p>
+    <w:p>
+      <w:pPr>
+        <w:spacing w:after="100"/>
+        <w:ind w:left="360"/>
+      </w:pPr>
+      <w:r>
+        <w:rPr>
+          <w:b/>
+          <w:bCs/>
+          <w:color w:val="0F766E"/>
+        </w:rPr>
+        <w:t xml:space="preserve">Bước 3. </w:t>
+      </w:r>
+      <w:r>
+        <w:rPr>
+          <w:b w:val="false"/>
+          <w:bCs w:val="false"/>
+        </w:rPr>
+        <w:t xml:space="preserve">Bấm </w:t>
+      </w:r>
+      <w:r>
+        <w:rPr>
+          <w:b/>
+          <w:bCs/>
+          <w:color w:val="0F172A"/>
+        </w:rPr>
+        <w:t xml:space="preserve">Tôi hiểu, tải xuống</w:t>
+      </w:r>
+      <w:r>
+        <w:rPr>
+          <w:b w:val="false"/>
+          <w:bCs w:val="false"/>
+        </w:rPr>
+        <w:t xml:space="preserve"> để tải file Excel chứa toàn bộ dữ liệu của bạn.</w:t>
+      </w:r>
+    </w:p>
+    <w:p>
+      <w:pPr>
+        <w:spacing w:after="80"/>
+        <w:ind w:left="360"/>
+      </w:pPr>
+      <w:r>
+        <w:drawing>
+          <wp:inline distT="0" distB="0" distL="0" distR="0">
+            <wp:extent cx="5486400" cy="3429000"/>
+            <wp:effectExtent t="0" r="0" b="0" l="0"/>
+            <wp:docPr id="57" name="" descr="" title=""/>
+            <wp:cNvGraphicFramePr>
+              <a:graphicFrameLocks xmlns:a="http://schemas.openxmlformats.org/drawingml/2006/main" noChangeAspect="1"/>
+            </wp:cNvGraphicFramePr>
+            <a:graphic xmlns:a="http://schemas.openxmlformats.org/drawingml/2006/main">
+              <a:graphicData uri="http://schemas.openxmlformats.org/drawingml/2006/picture">
+                <pic:pic xmlns:pic="http://schemas.openxmlformats.org/drawingml/2006/picture">
+                  <pic:nvPicPr>
+                    <pic:cNvPr id="0" name="" descr=""/>
+                    <pic:cNvPicPr>
+                      <a:picLocks noChangeAspect="1" noChangeArrowheads="1"/>
+                    </pic:cNvPicPr>
+                  </pic:nvPicPr>
+                  <pic:blipFill>
+                    <a:blip r:embed="rId63" cstate="none"/>
+                    <a:srcRect/>
+                    <a:stretch>
+                      <a:fillRect/>
+                    </a:stretch>
+                  </pic:blipFill>
+                  <pic:spPr bwMode="auto">
+                    <a:xfrm>
+                      <a:off x="0" y="0"/>
+                      <a:ext cx="5486400" cy="3429000"/>
+                    </a:xfrm>
+                    <a:prstGeom prst="rect">
+                      <a:avLst/>
+                    </a:prstGeom>
+                  </pic:spPr>
+                </pic:pic>
+              </a:graphicData>
+            </a:graphic>
+          </wp:inline>
+        </w:drawing>
+      </w:r>
+    </w:p>
+    <w:p>
+      <w:pPr>
+        <w:spacing w:after="160"/>
+        <w:ind w:left="360"/>
+      </w:pPr>
+      <w:r>
+        <w:drawing>
+          <wp:inline distT="0" distB="0" distL="0" distR="0">
+            <wp:extent cx="1581150" cy="3429000"/>
+            <wp:effectExtent t="0" r="0" b="0" l="0"/>
+            <wp:docPr id="58" name="" descr="" title=""/>
+            <wp:cNvGraphicFramePr>
+              <a:graphicFrameLocks xmlns:a="http://schemas.openxmlformats.org/drawingml/2006/main" noChangeAspect="1"/>
+            </wp:cNvGraphicFramePr>
+            <a:graphic xmlns:a="http://schemas.openxmlformats.org/drawingml/2006/main">
+              <a:graphicData uri="http://schemas.openxmlformats.org/drawingml/2006/picture">
+                <pic:pic xmlns:pic="http://schemas.openxmlformats.org/drawingml/2006/picture">
+                  <pic:nvPicPr>
+                    <pic:cNvPr id="0" name="" descr=""/>
+                    <pic:cNvPicPr>
+                      <a:picLocks noChangeAspect="1" noChangeArrowheads="1"/>
+                    </pic:cNvPicPr>
+                  </pic:nvPicPr>
+                  <pic:blipFill>
+                    <a:blip r:embed="rId64" cstate="none"/>
                     <a:srcRect/>
                     <a:stretch>
                       <a:fillRect/>

</xml_diff>

<commit_message>
[AK] Phát hành 0.19.0
</commit_message>
<xml_diff>
--- a/public/guide/huong-dan-su-dung.docx
+++ b/public/guide/huong-dan-su-dung.docx
@@ -2391,7 +2391,22 @@
           <w:b w:val="false"/>
           <w:bCs w:val="false"/>
         </w:rPr>
-        <w:t xml:space="preserve">Cuối tháng dùng </w:t>
+        <w:t xml:space="preserve">Cuối tháng bấm mũi tên cạnh </w:t>
+      </w:r>
+      <w:r>
+        <w:rPr>
+          <w:b/>
+          <w:bCs/>
+          <w:color w:val="0F172A"/>
+        </w:rPr>
+        <w:t xml:space="preserve">Tạo ca dạy</w:t>
+      </w:r>
+      <w:r>
+        <w:rPr>
+          <w:b w:val="false"/>
+          <w:bCs w:val="false"/>
+        </w:rPr>
+        <w:t xml:space="preserve">, chọn </w:t>
       </w:r>
       <w:r>
         <w:rPr>

</xml_diff>